<commit_message>
Integrate 2024/2025 indicators, 2025 calendar and user survey into the project
Co-Authored-By: Claude Opus 5.5 <noreply@anthropic.com>
Claude-Session: https://claude.ai/code/session_01DAHviCoFUxWLSqCJvmpav8
</commit_message>
<xml_diff>
--- a/excellence_project/مشروع_التميز_التدريب_التمريضي_المطور.docx
+++ b/excellence_project/مشروع_التميز_التدريب_التمريضي_المطور.docx
@@ -1346,17 +1346,17 @@
                 <w:szCs w:val="18"/>
                 <w:rtl/>
               </w:rPr>
-              <w:t xml:space="preserve">إعادة محاضرات في ربعين مختلفين</w:t>
-            </w:r>
-            <w:r>
-              <w:rPr>
-                <w:rFonts w:ascii="Arial" w:cs="Arial" w:hAnsi="Arial"/>
-                <w:color w:val="1D2B36"/>
-                <w:sz w:val="18"/>
-                <w:szCs w:val="18"/>
-                <w:rtl/>
-              </w:rPr>
-              <w:t xml:space="preserve"> وجهدًا تنسيقيًا متكررًا، مع </w:t>
+              <w:t xml:space="preserve">جدولة 106 جلسات مباشرة لـ53 موضوعًا في خطة 2025 (كُرِّر 92% منها مرتين أو أكثر)</w:t>
+            </w:r>
+            <w:r>
+              <w:rPr>
+                <w:rFonts w:ascii="Arial" w:cs="Arial" w:hAnsi="Arial"/>
+                <w:color w:val="1D2B36"/>
+                <w:sz w:val="18"/>
+                <w:szCs w:val="18"/>
+                <w:rtl/>
+              </w:rPr>
+              <w:t xml:space="preserve">، وترحيل 51 موضوعًا من خطة 2024 شكّلت 83% من مستهدف حضور 2025، مع جهد تنسيقي متكرر و</w:t>
             </w:r>
             <w:r>
               <w:rPr>
@@ -1968,7 +1968,7 @@
                 <w:szCs w:val="18"/>
                 <w:rtl/>
               </w:rPr>
-              <w:t xml:space="preserve">، وتراوح إنجاز 2024 بين 9.5% و72.7%. ورغم التحسن الجزئي في 2025 بتكثيف محاضرات Zoom وإعادة بعضها، استمر الاعتماد على مواعيد ثابتة. حُدِّد نطاق التحسين بعملية </w:t>
+              <w:t xml:space="preserve">، وتراوح إنجاز 2024 بين 9.5% و72.7%. وعلى مستوى التجمع جاء قطاع البكيرية في المرتبة 11 من 15 قطاعًا في 2024 بنسبة حضور 83.8% مقابل 99.9% لأعلى قطاع. ورغم التحسن الجزئي في 2025 بتكثيف محاضرات Zoom وإعادة بعضها، استمر الاعتماد على مواعيد ثابتة. حُدِّد نطاق التحسين بعملية </w:t>
             </w:r>
             <w:r>
               <w:rPr>
@@ -2020,249 +2020,7 @@
                 <w:szCs w:val="18"/>
                 <w:rtl/>
               </w:rPr>
-              <w:t xml:space="preserve">تحليل فجوات الأداء (Gap Analysis) + مراجعة البيانات التاريخية</w:t>
-            </w:r>
-          </w:p>
-        </w:tc>
-        <w:tc>
-          <w:tcPr>
-            <w:tcW w:type="dxa" w:w="4400"/>
-            <w:tcBorders>
-              <w:top w:val="single" w:color="7F9DB5" w:sz="6"/>
-              <w:left w:val="single" w:color="7F9DB5" w:sz="6"/>
-              <w:bottom w:val="single" w:color="7F9DB5" w:sz="6"/>
-              <w:right w:val="single" w:color="7F9DB5" w:sz="6"/>
-            </w:tcBorders>
-            <w:tcMar>
-              <w:top w:type="dxa" w:w="60"/>
-              <w:left w:type="dxa" w:w="100"/>
-              <w:bottom w:type="dxa" w:w="60"/>
-              <w:right w:type="dxa" w:w="100"/>
-            </w:tcMar>
-            <w:vAlign w:val="center"/>
-          </w:tcPr>
-          <w:p>
-            <w:pPr>
-              <w:spacing w:after="0"/>
-              <w:jc w:val="center"/>
-            </w:pPr>
-            <w:r>
-              <w:drawing>
-                <wp:inline distT="0" distB="0" distL="0" distR="0">
-                  <wp:extent cx="2714625" cy="1695450"/>
-                  <wp:effectExtent t="0" r="0" b="0" l="0"/>
-                  <wp:docPr id="1" name="" descr="" title=""/>
-                  <wp:cNvGraphicFramePr>
-                    <a:graphicFrameLocks xmlns:a="http://schemas.openxmlformats.org/drawingml/2006/main" noChangeAspect="1"/>
-                  </wp:cNvGraphicFramePr>
-                  <a:graphic xmlns:a="http://schemas.openxmlformats.org/drawingml/2006/main">
-                    <a:graphicData uri="http://schemas.openxmlformats.org/drawingml/2006/picture">
-                      <pic:pic xmlns:pic="http://schemas.openxmlformats.org/drawingml/2006/picture">
-                        <pic:nvPicPr>
-                          <pic:cNvPr id="0" name="" descr=""/>
-                          <pic:cNvPicPr>
-                            <a:picLocks noChangeAspect="1" noChangeArrowheads="1"/>
-                          </pic:cNvPicPr>
-                        </pic:nvPicPr>
-                        <pic:blipFill>
-                          <a:blip r:embed="rId8" cstate="none"/>
-                          <a:srcRect/>
-                          <a:stretch>
-                            <a:fillRect/>
-                          </a:stretch>
-                        </pic:blipFill>
-                        <pic:spPr bwMode="auto">
-                          <a:xfrm>
-                            <a:off x="0" y="0"/>
-                            <a:ext cx="2714625" cy="1695450"/>
-                          </a:xfrm>
-                          <a:prstGeom prst="rect">
-                            <a:avLst/>
-                          </a:prstGeom>
-                        </pic:spPr>
-                      </pic:pic>
-                    </a:graphicData>
-                  </a:graphic>
-                </wp:inline>
-              </w:drawing>
-            </w:r>
-          </w:p>
-        </w:tc>
-      </w:tr>
-      <w:tr>
-        <w:trPr>
-          <w:cantSplit/>
-        </w:trPr>
-        <w:tc>
-          <w:tcPr>
-            <w:tcW w:type="dxa" w:w="5906"/>
-            <w:tcBorders>
-              <w:top w:val="single" w:color="7F9DB5" w:sz="6"/>
-              <w:left w:val="single" w:color="7F9DB5" w:sz="6"/>
-              <w:bottom w:val="single" w:color="7F9DB5" w:sz="6"/>
-              <w:right w:val="single" w:color="7F9DB5" w:sz="6"/>
-            </w:tcBorders>
-            <w:tcMar>
-              <w:top w:type="dxa" w:w="60"/>
-              <w:left w:type="dxa" w:w="100"/>
-              <w:bottom w:type="dxa" w:w="60"/>
-              <w:right w:type="dxa" w:w="100"/>
-            </w:tcMar>
-            <w:vAlign w:val="top"/>
-          </w:tcPr>
-          <w:p>
-            <w:pPr>
-              <w:bidi/>
-              <w:spacing w:after="60" w:before="0" w:line="260"/>
-            </w:pPr>
-            <w:r>
-              <w:rPr>
-                <w:rFonts w:ascii="Arial" w:cs="Arial" w:hAnsi="Arial"/>
-                <w:b/>
-                <w:bCs/>
-                <w:color w:val="0B3C5D"/>
-                <w:sz w:val="20"/>
-                <w:szCs w:val="20"/>
-                <w:rtl/>
-              </w:rPr>
-              <w:t xml:space="preserve">O: Organize Team – </w:t>
-            </w:r>
-            <w:r>
-              <w:rPr>
-                <w:rFonts w:ascii="Arial" w:cs="Arial" w:hAnsi="Arial"/>
-                <w:b/>
-                <w:bCs/>
-                <w:color w:val="0B3C5D"/>
-                <w:sz w:val="20"/>
-                <w:szCs w:val="20"/>
-                <w:rtl/>
-              </w:rPr>
-              <w:t xml:space="preserve">تشكيل الفريق</w:t>
-            </w:r>
-          </w:p>
-          <w:p>
-            <w:pPr>
-              <w:bidi/>
-              <w:spacing w:after="60" w:before="0" w:line="260"/>
-              <w:jc w:val="both"/>
-            </w:pPr>
-            <w:r>
-              <w:rPr>
-                <w:rFonts w:ascii="Arial" w:cs="Arial" w:hAnsi="Arial"/>
-                <w:b/>
-                <w:bCs/>
-                <w:color w:val="0E8A8A"/>
-                <w:sz w:val="18"/>
-                <w:szCs w:val="18"/>
-                <w:rtl/>
-              </w:rPr>
-              <w:t xml:space="preserve">الوصف: </w:t>
-            </w:r>
-            <w:r>
-              <w:rPr>
-                <w:rFonts w:ascii="Arial" w:cs="Arial" w:hAnsi="Arial"/>
-                <w:color w:val="1D2B36"/>
-                <w:sz w:val="18"/>
-                <w:szCs w:val="18"/>
-                <w:rtl/>
-              </w:rPr>
-              <w:t xml:space="preserve">مبادرة بقيادة </w:t>
-            </w:r>
-            <w:r>
-              <w:rPr>
-                <w:rFonts w:ascii="Arial" w:cs="Arial" w:hAnsi="Arial"/>
-                <w:b/>
-                <w:bCs/>
-                <w:color w:val="1D2B36"/>
-                <w:sz w:val="18"/>
-                <w:szCs w:val="18"/>
-                <w:rtl/>
-              </w:rPr>
-              <w:t xml:space="preserve">مشرفة التدريب والتعليم التمريضي</w:t>
-            </w:r>
-            <w:r>
-              <w:rPr>
-                <w:rFonts w:ascii="Arial" w:cs="Arial" w:hAnsi="Arial"/>
-                <w:color w:val="1D2B36"/>
-                <w:sz w:val="18"/>
-                <w:szCs w:val="18"/>
-                <w:rtl/>
-              </w:rPr>
-              <w:t xml:space="preserve"> (المساءلة والتنفيذ: تحليل البيانات، تصميم التدخل، إعداد المحتوى والاختبارات، التنسيق مع المراكز، قياس النتائج)، بدعم </w:t>
-            </w:r>
-            <w:r>
-              <w:rPr>
-                <w:rFonts w:ascii="Arial" w:cs="Arial" w:hAnsi="Arial"/>
-                <w:b/>
-                <w:bCs/>
-                <w:color w:val="1D2B36"/>
-                <w:sz w:val="18"/>
-                <w:szCs w:val="18"/>
-                <w:rtl/>
-              </w:rPr>
-              <w:t xml:space="preserve">مطوّر تقني</w:t>
-            </w:r>
-            <w:r>
-              <w:rPr>
-                <w:rFonts w:ascii="Arial" w:cs="Arial" w:hAnsi="Arial"/>
-                <w:color w:val="1D2B36"/>
-                <w:sz w:val="18"/>
-                <w:szCs w:val="18"/>
-                <w:rtl/>
-              </w:rPr>
-              <w:t xml:space="preserve"> لبرمجة المنصة وفق المتطلبات المحددة، وبالتنسيق مع </w:t>
-            </w:r>
-            <w:r>
-              <w:rPr>
-                <w:rFonts w:ascii="Arial" w:cs="Arial" w:hAnsi="Arial"/>
-                <w:b/>
-                <w:bCs/>
-                <w:color w:val="1D2B36"/>
-                <w:sz w:val="18"/>
-                <w:szCs w:val="18"/>
-                <w:rtl/>
-              </w:rPr>
-              <w:t xml:space="preserve">المراكز الصحية العشرة</w:t>
-            </w:r>
-            <w:r>
-              <w:rPr>
-                <w:rFonts w:ascii="Arial" w:cs="Arial" w:hAnsi="Arial"/>
-                <w:color w:val="1D2B36"/>
-                <w:sz w:val="18"/>
-                <w:szCs w:val="18"/>
-                <w:rtl/>
-              </w:rPr>
-              <w:t xml:space="preserve"> لتسهيل التطبيق والورش. وُثِّقت الأدوار في مصفوفة RACI لضمان وضوح المساءلة ومنع ازدواج المهام.</w:t>
-            </w:r>
-          </w:p>
-          <w:p>
-            <w:pPr>
-              <w:bidi/>
-              <w:spacing w:after="0" w:before="0" w:line="260"/>
-            </w:pPr>
-            <w:r>
-              <w:rPr>
-                <w:rFonts w:ascii="Arial" w:cs="Arial" w:hAnsi="Arial"/>
-                <w:b/>
-                <w:bCs/>
-                <w:color w:val="0E8A8A"/>
-                <w:sz w:val="18"/>
-                <w:szCs w:val="18"/>
-                <w:rtl/>
-              </w:rPr>
-              <w:t xml:space="preserve">الأداة: </w:t>
-            </w:r>
-            <w:r>
-              <w:rPr>
-                <w:rFonts w:ascii="Arial" w:cs="Arial" w:hAnsi="Arial"/>
-                <w:b/>
-                <w:bCs/>
-                <w:color w:val="1D2B36"/>
-                <w:sz w:val="18"/>
-                <w:szCs w:val="18"/>
-                <w:rtl/>
-              </w:rPr>
-              <w:t xml:space="preserve">مصفوفة المسؤوليات (RACI Matrix)</w:t>
+              <w:t xml:space="preserve">تحليل فجوات الأداء (Gap Analysis) + المقارنة المرجعية (Benchmarking)</w:t>
             </w:r>
           </w:p>
         </w:tc>
@@ -2367,7 +2125,7 @@
                 <w:szCs w:val="20"/>
                 <w:rtl/>
               </w:rPr>
-              <w:t xml:space="preserve">C: Clarity – </w:t>
+              <w:t xml:space="preserve">O: Organize Team – </w:t>
             </w:r>
             <w:r>
               <w:rPr>
@@ -2379,7 +2137,7 @@
                 <w:szCs w:val="20"/>
                 <w:rtl/>
               </w:rPr>
-              <w:t xml:space="preserve">توضيح العملية المتعلقة بالمشكلة</w:t>
+              <w:t xml:space="preserve">تشكيل الفريق</w:t>
             </w:r>
           </w:p>
           <w:p>
@@ -2408,41 +2166,73 @@
                 <w:szCs w:val="18"/>
                 <w:rtl/>
               </w:rPr>
-              <w:t xml:space="preserve">رُسمت العملية الحالية (As-Is) في 5 خطوات وحُدِّدت </w:t>
-            </w:r>
-            <w:r>
-              <w:rPr>
-                <w:rFonts w:ascii="Arial" w:cs="Arial" w:hAnsi="Arial"/>
-                <w:b/>
-                <w:bCs/>
-                <w:color w:val="1D2B36"/>
-                <w:sz w:val="18"/>
-                <w:szCs w:val="18"/>
-                <w:rtl/>
-              </w:rPr>
-              <w:t xml:space="preserve">4 نقاط اختناق/هدر</w:t>
-            </w:r>
-            <w:r>
-              <w:rPr>
-                <w:rFonts w:ascii="Arial" w:cs="Arial" w:hAnsi="Arial"/>
-                <w:color w:val="1D2B36"/>
-                <w:sz w:val="18"/>
-                <w:szCs w:val="18"/>
-                <w:rtl/>
-              </w:rPr>
-              <w:t xml:space="preserve">: الموعد الثابت للبث، والتنسيق المتكرر مع 10 مراكز، وتعارض الحضور مع المناوبات، وإعادة المحاضرة لمن تغيّب، مع غياب نقطة لقياس أثر التعلّم. ثم صُمِّمت العملية المستهدفة (To-Be) مسارَ تعلّمٍ مدمج عند الطلب: </w:t>
-            </w:r>
-            <w:r>
-              <w:rPr>
-                <w:rFonts w:ascii="Arial" w:cs="Arial" w:hAnsi="Arial"/>
-                <w:b/>
-                <w:bCs/>
-                <w:color w:val="1D2B36"/>
-                <w:sz w:val="18"/>
-                <w:szCs w:val="18"/>
-                <w:rtl/>
-              </w:rPr>
-              <w:t xml:space="preserve">دخول المنصة ← اختبار قبلي ← محتوى مسجّل ← اختبار بعدي ← اختبار احتفاظ وورشة تطبيقية.</w:t>
+              <w:t xml:space="preserve">مبادرة بقيادة </w:t>
+            </w:r>
+            <w:r>
+              <w:rPr>
+                <w:rFonts w:ascii="Arial" w:cs="Arial" w:hAnsi="Arial"/>
+                <w:b/>
+                <w:bCs/>
+                <w:color w:val="1D2B36"/>
+                <w:sz w:val="18"/>
+                <w:szCs w:val="18"/>
+                <w:rtl/>
+              </w:rPr>
+              <w:t xml:space="preserve">مشرفة التدريب والتعليم التمريضي</w:t>
+            </w:r>
+            <w:r>
+              <w:rPr>
+                <w:rFonts w:ascii="Arial" w:cs="Arial" w:hAnsi="Arial"/>
+                <w:color w:val="1D2B36"/>
+                <w:sz w:val="18"/>
+                <w:szCs w:val="18"/>
+                <w:rtl/>
+              </w:rPr>
+              <w:t xml:space="preserve"> (المساءلة والتنفيذ: تحليل البيانات، تصميم التدخل، إعداد المحتوى والاختبارات، التنسيق مع المراكز، قياس النتائج)، بدعم </w:t>
+            </w:r>
+            <w:r>
+              <w:rPr>
+                <w:rFonts w:ascii="Arial" w:cs="Arial" w:hAnsi="Arial"/>
+                <w:b/>
+                <w:bCs/>
+                <w:color w:val="1D2B36"/>
+                <w:sz w:val="18"/>
+                <w:szCs w:val="18"/>
+                <w:rtl/>
+              </w:rPr>
+              <w:t xml:space="preserve">مطوّر تقني</w:t>
+            </w:r>
+            <w:r>
+              <w:rPr>
+                <w:rFonts w:ascii="Arial" w:cs="Arial" w:hAnsi="Arial"/>
+                <w:color w:val="1D2B36"/>
+                <w:sz w:val="18"/>
+                <w:szCs w:val="18"/>
+                <w:rtl/>
+              </w:rPr>
+              <w:t xml:space="preserve"> لبرمجة المنصة وفق المتطلبات المحددة، وبالتنسيق مع </w:t>
+            </w:r>
+            <w:r>
+              <w:rPr>
+                <w:rFonts w:ascii="Arial" w:cs="Arial" w:hAnsi="Arial"/>
+                <w:b/>
+                <w:bCs/>
+                <w:color w:val="1D2B36"/>
+                <w:sz w:val="18"/>
+                <w:szCs w:val="18"/>
+                <w:rtl/>
+              </w:rPr>
+              <w:t xml:space="preserve">المراكز الصحية العشرة</w:t>
+            </w:r>
+            <w:r>
+              <w:rPr>
+                <w:rFonts w:ascii="Arial" w:cs="Arial" w:hAnsi="Arial"/>
+                <w:color w:val="1D2B36"/>
+                <w:sz w:val="18"/>
+                <w:szCs w:val="18"/>
+                <w:rtl/>
+              </w:rPr>
+              <w:t xml:space="preserve"> لتسهيل التطبيق والورش. وُثِّقت الأدوار في مصفوفة RACI لضمان وضوح المساءلة ومنع ازدواج المهام.</w:t>
             </w:r>
           </w:p>
           <w:p>
@@ -2472,7 +2262,7 @@
                 <w:szCs w:val="18"/>
                 <w:rtl/>
               </w:rPr>
-              <w:t xml:space="preserve">مخطط سير العملية قبل/بعد (Process Flowchart: As-Is / To-Be)</w:t>
+              <w:t xml:space="preserve">مصفوفة المسؤوليات (RACI Matrix)</w:t>
             </w:r>
           </w:p>
         </w:tc>
@@ -2548,6 +2338,216 @@
         <w:tc>
           <w:tcPr>
             <w:tcW w:type="dxa" w:w="5906"/>
+            <w:tcBorders>
+              <w:top w:val="single" w:color="7F9DB5" w:sz="6"/>
+              <w:left w:val="single" w:color="7F9DB5" w:sz="6"/>
+              <w:bottom w:val="single" w:color="7F9DB5" w:sz="6"/>
+              <w:right w:val="single" w:color="7F9DB5" w:sz="6"/>
+            </w:tcBorders>
+            <w:tcMar>
+              <w:top w:type="dxa" w:w="60"/>
+              <w:left w:type="dxa" w:w="100"/>
+              <w:bottom w:type="dxa" w:w="60"/>
+              <w:right w:type="dxa" w:w="100"/>
+            </w:tcMar>
+            <w:vAlign w:val="top"/>
+          </w:tcPr>
+          <w:p>
+            <w:pPr>
+              <w:bidi/>
+              <w:spacing w:after="60" w:before="0" w:line="260"/>
+            </w:pPr>
+            <w:r>
+              <w:rPr>
+                <w:rFonts w:ascii="Arial" w:cs="Arial" w:hAnsi="Arial"/>
+                <w:b/>
+                <w:bCs/>
+                <w:color w:val="0B3C5D"/>
+                <w:sz w:val="20"/>
+                <w:szCs w:val="20"/>
+                <w:rtl/>
+              </w:rPr>
+              <w:t xml:space="preserve">C: Clarity – </w:t>
+            </w:r>
+            <w:r>
+              <w:rPr>
+                <w:rFonts w:ascii="Arial" w:cs="Arial" w:hAnsi="Arial"/>
+                <w:b/>
+                <w:bCs/>
+                <w:color w:val="0B3C5D"/>
+                <w:sz w:val="20"/>
+                <w:szCs w:val="20"/>
+                <w:rtl/>
+              </w:rPr>
+              <w:t xml:space="preserve">توضيح العملية المتعلقة بالمشكلة</w:t>
+            </w:r>
+          </w:p>
+          <w:p>
+            <w:pPr>
+              <w:bidi/>
+              <w:spacing w:after="60" w:before="0" w:line="260"/>
+              <w:jc w:val="both"/>
+            </w:pPr>
+            <w:r>
+              <w:rPr>
+                <w:rFonts w:ascii="Arial" w:cs="Arial" w:hAnsi="Arial"/>
+                <w:b/>
+                <w:bCs/>
+                <w:color w:val="0E8A8A"/>
+                <w:sz w:val="18"/>
+                <w:szCs w:val="18"/>
+                <w:rtl/>
+              </w:rPr>
+              <w:t xml:space="preserve">الوصف: </w:t>
+            </w:r>
+            <w:r>
+              <w:rPr>
+                <w:rFonts w:ascii="Arial" w:cs="Arial" w:hAnsi="Arial"/>
+                <w:color w:val="1D2B36"/>
+                <w:sz w:val="18"/>
+                <w:szCs w:val="18"/>
+                <w:rtl/>
+              </w:rPr>
+              <w:t xml:space="preserve">رُسمت العملية الحالية (As-Is) في 5 خطوات وحُدِّدت </w:t>
+            </w:r>
+            <w:r>
+              <w:rPr>
+                <w:rFonts w:ascii="Arial" w:cs="Arial" w:hAnsi="Arial"/>
+                <w:b/>
+                <w:bCs/>
+                <w:color w:val="1D2B36"/>
+                <w:sz w:val="18"/>
+                <w:szCs w:val="18"/>
+                <w:rtl/>
+              </w:rPr>
+              <w:t xml:space="preserve">4 نقاط اختناق/هدر</w:t>
+            </w:r>
+            <w:r>
+              <w:rPr>
+                <w:rFonts w:ascii="Arial" w:cs="Arial" w:hAnsi="Arial"/>
+                <w:color w:val="1D2B36"/>
+                <w:sz w:val="18"/>
+                <w:szCs w:val="18"/>
+                <w:rtl/>
+              </w:rPr>
+              <w:t xml:space="preserve">: الموعد الثابت للبث، والتنسيق المتكرر مع 10 مراكز، وتعارض الحضور مع المناوبات، وإعادة المحاضرة لمن تغيّب، مع غياب نقطة لقياس أثر التعلّم. ثم صُمِّمت العملية المستهدفة (To-Be) مسارَ تعلّمٍ مدمج عند الطلب: </w:t>
+            </w:r>
+            <w:r>
+              <w:rPr>
+                <w:rFonts w:ascii="Arial" w:cs="Arial" w:hAnsi="Arial"/>
+                <w:b/>
+                <w:bCs/>
+                <w:color w:val="1D2B36"/>
+                <w:sz w:val="18"/>
+                <w:szCs w:val="18"/>
+                <w:rtl/>
+              </w:rPr>
+              <w:t xml:space="preserve">دخول المنصة ← اختبار قبلي ← محتوى مسجّل ← اختبار بعدي ← اختبار احتفاظ وورشة تطبيقية.</w:t>
+            </w:r>
+          </w:p>
+          <w:p>
+            <w:pPr>
+              <w:bidi/>
+              <w:spacing w:after="0" w:before="0" w:line="260"/>
+            </w:pPr>
+            <w:r>
+              <w:rPr>
+                <w:rFonts w:ascii="Arial" w:cs="Arial" w:hAnsi="Arial"/>
+                <w:b/>
+                <w:bCs/>
+                <w:color w:val="0E8A8A"/>
+                <w:sz w:val="18"/>
+                <w:szCs w:val="18"/>
+                <w:rtl/>
+              </w:rPr>
+              <w:t xml:space="preserve">الأداة: </w:t>
+            </w:r>
+            <w:r>
+              <w:rPr>
+                <w:rFonts w:ascii="Arial" w:cs="Arial" w:hAnsi="Arial"/>
+                <w:b/>
+                <w:bCs/>
+                <w:color w:val="1D2B36"/>
+                <w:sz w:val="18"/>
+                <w:szCs w:val="18"/>
+                <w:rtl/>
+              </w:rPr>
+              <w:t xml:space="preserve">مخطط سير العملية قبل/بعد (Process Flowchart: As-Is / To-Be)</w:t>
+            </w:r>
+          </w:p>
+        </w:tc>
+        <w:tc>
+          <w:tcPr>
+            <w:tcW w:type="dxa" w:w="4400"/>
+            <w:tcBorders>
+              <w:top w:val="single" w:color="7F9DB5" w:sz="6"/>
+              <w:left w:val="single" w:color="7F9DB5" w:sz="6"/>
+              <w:bottom w:val="single" w:color="7F9DB5" w:sz="6"/>
+              <w:right w:val="single" w:color="7F9DB5" w:sz="6"/>
+            </w:tcBorders>
+            <w:tcMar>
+              <w:top w:type="dxa" w:w="60"/>
+              <w:left w:type="dxa" w:w="100"/>
+              <w:bottom w:type="dxa" w:w="60"/>
+              <w:right w:type="dxa" w:w="100"/>
+            </w:tcMar>
+            <w:vAlign w:val="center"/>
+          </w:tcPr>
+          <w:p>
+            <w:pPr>
+              <w:spacing w:after="0"/>
+              <w:jc w:val="center"/>
+            </w:pPr>
+            <w:r>
+              <w:drawing>
+                <wp:inline distT="0" distB="0" distL="0" distR="0">
+                  <wp:extent cx="2714625" cy="1695450"/>
+                  <wp:effectExtent t="0" r="0" b="0" l="0"/>
+                  <wp:docPr id="1" name="" descr="" title=""/>
+                  <wp:cNvGraphicFramePr>
+                    <a:graphicFrameLocks xmlns:a="http://schemas.openxmlformats.org/drawingml/2006/main" noChangeAspect="1"/>
+                  </wp:cNvGraphicFramePr>
+                  <a:graphic xmlns:a="http://schemas.openxmlformats.org/drawingml/2006/main">
+                    <a:graphicData uri="http://schemas.openxmlformats.org/drawingml/2006/picture">
+                      <pic:pic xmlns:pic="http://schemas.openxmlformats.org/drawingml/2006/picture">
+                        <pic:nvPicPr>
+                          <pic:cNvPr id="0" name="" descr=""/>
+                          <pic:cNvPicPr>
+                            <a:picLocks noChangeAspect="1" noChangeArrowheads="1"/>
+                          </pic:cNvPicPr>
+                        </pic:nvPicPr>
+                        <pic:blipFill>
+                          <a:blip r:embed="rId12" cstate="none"/>
+                          <a:srcRect/>
+                          <a:stretch>
+                            <a:fillRect/>
+                          </a:stretch>
+                        </pic:blipFill>
+                        <pic:spPr bwMode="auto">
+                          <a:xfrm>
+                            <a:off x="0" y="0"/>
+                            <a:ext cx="2714625" cy="1695450"/>
+                          </a:xfrm>
+                          <a:prstGeom prst="rect">
+                            <a:avLst/>
+                          </a:prstGeom>
+                        </pic:spPr>
+                      </pic:pic>
+                    </a:graphicData>
+                  </a:graphic>
+                </wp:inline>
+              </w:drawing>
+            </w:r>
+          </w:p>
+        </w:tc>
+      </w:tr>
+      <w:tr>
+        <w:trPr>
+          <w:cantSplit/>
+        </w:trPr>
+        <w:tc>
+          <w:tcPr>
+            <w:tcW w:type="dxa" w:w="5906"/>
             <w:gridSpan w:val="2"/>
             <w:tcBorders>
               <w:top w:val="single" w:color="7F9DB5" w:sz="6"/>
@@ -2673,7 +2673,7 @@
                 <w:szCs w:val="18"/>
                 <w:rtl/>
               </w:rPr>
-              <w:t xml:space="preserve">(1) ارتباط التدريب النظري بموعد متزامن واحد لا يتوافق مع المناوبات، (2) غياب مسار منهجي لقياس التعلّم يوجّه المتابعة. واستُبعد «غياب المؤشرات» لأنها معتمدة ومتاحة.</w:t>
+              <w:t xml:space="preserve">(1) ارتباط التدريب النظري بموعد متزامن واحد لا يتوافق مع المناوبات، (2) غياب مسار منهجي لقياس التعلّم يوجّه المتابعة. وأكدت بيانات 2025 عبء الترحيل؛ إذ شكّلت موضوعات 2024 المُرحّلة 83% من مستهدف الحضور. واستُبعد «غياب المؤشرات» لأنها معتمدة ومتاحة.</w:t>
             </w:r>
           </w:p>
           <w:p>
@@ -2754,7 +2754,7 @@
                           </pic:cNvPicPr>
                         </pic:nvPicPr>
                         <pic:blipFill>
-                          <a:blip r:embed="rId12" cstate="none"/>
+                          <a:blip r:embed="rId13" cstate="none"/>
                           <a:srcRect/>
                           <a:stretch>
                             <a:fillRect/>
@@ -2996,7 +2996,7 @@
                           </pic:cNvPicPr>
                         </pic:nvPicPr>
                         <pic:blipFill>
-                          <a:blip r:embed="rId13" cstate="none"/>
+                          <a:blip r:embed="rId14" cstate="none"/>
                           <a:srcRect/>
                           <a:stretch>
                             <a:fillRect/>
@@ -3394,7 +3394,7 @@
                           </pic:cNvPicPr>
                         </pic:nvPicPr>
                         <pic:blipFill>
-                          <a:blip r:embed="rId14" cstate="none"/>
+                          <a:blip r:embed="rId15" cstate="none"/>
                           <a:srcRect/>
                           <a:stretch>
                             <a:fillRect/>
@@ -3570,292 +3570,6 @@
                 <w:rtl/>
               </w:rPr>
               <w:t xml:space="preserve">قائمة التحقق من التنفيذ (Implementation Checklist) + التجربة المرحلية (Pilot)</w:t>
-            </w:r>
-          </w:p>
-        </w:tc>
-        <w:tc>
-          <w:tcPr>
-            <w:tcW w:type="dxa" w:w="4400"/>
-            <w:tcBorders>
-              <w:top w:val="single" w:color="7F9DB5" w:sz="6"/>
-              <w:left w:val="single" w:color="7F9DB5" w:sz="6"/>
-              <w:bottom w:val="single" w:color="7F9DB5" w:sz="6"/>
-              <w:right w:val="single" w:color="7F9DB5" w:sz="6"/>
-            </w:tcBorders>
-            <w:tcMar>
-              <w:top w:type="dxa" w:w="60"/>
-              <w:left w:type="dxa" w:w="100"/>
-              <w:bottom w:type="dxa" w:w="60"/>
-              <w:right w:type="dxa" w:w="100"/>
-            </w:tcMar>
-            <w:vAlign w:val="center"/>
-          </w:tcPr>
-          <w:p>
-            <w:pPr>
-              <w:spacing w:after="0"/>
-              <w:jc w:val="center"/>
-            </w:pPr>
-            <w:r>
-              <w:drawing>
-                <wp:inline distT="0" distB="0" distL="0" distR="0">
-                  <wp:extent cx="2714625" cy="1695450"/>
-                  <wp:effectExtent t="0" r="0" b="0" l="0"/>
-                  <wp:docPr id="1" name="" descr="" title=""/>
-                  <wp:cNvGraphicFramePr>
-                    <a:graphicFrameLocks xmlns:a="http://schemas.openxmlformats.org/drawingml/2006/main" noChangeAspect="1"/>
-                  </wp:cNvGraphicFramePr>
-                  <a:graphic xmlns:a="http://schemas.openxmlformats.org/drawingml/2006/main">
-                    <a:graphicData uri="http://schemas.openxmlformats.org/drawingml/2006/picture">
-                      <pic:pic xmlns:pic="http://schemas.openxmlformats.org/drawingml/2006/picture">
-                        <pic:nvPicPr>
-                          <pic:cNvPr id="0" name="" descr=""/>
-                          <pic:cNvPicPr>
-                            <a:picLocks noChangeAspect="1" noChangeArrowheads="1"/>
-                          </pic:cNvPicPr>
-                        </pic:nvPicPr>
-                        <pic:blipFill>
-                          <a:blip r:embed="rId15" cstate="none"/>
-                          <a:srcRect/>
-                          <a:stretch>
-                            <a:fillRect/>
-                          </a:stretch>
-                        </pic:blipFill>
-                        <pic:spPr bwMode="auto">
-                          <a:xfrm>
-                            <a:off x="0" y="0"/>
-                            <a:ext cx="2714625" cy="1695450"/>
-                          </a:xfrm>
-                          <a:prstGeom prst="rect">
-                            <a:avLst/>
-                          </a:prstGeom>
-                        </pic:spPr>
-                      </pic:pic>
-                    </a:graphicData>
-                  </a:graphic>
-                </wp:inline>
-              </w:drawing>
-            </w:r>
-          </w:p>
-        </w:tc>
-      </w:tr>
-      <w:tr>
-        <w:trPr>
-          <w:cantSplit/>
-        </w:trPr>
-        <w:tc>
-          <w:tcPr>
-            <w:tcW w:type="dxa" w:w="5906"/>
-            <w:tcBorders>
-              <w:top w:val="single" w:color="7F9DB5" w:sz="6"/>
-              <w:left w:val="single" w:color="7F9DB5" w:sz="6"/>
-              <w:bottom w:val="single" w:color="7F9DB5" w:sz="6"/>
-              <w:right w:val="single" w:color="7F9DB5" w:sz="6"/>
-            </w:tcBorders>
-            <w:tcMar>
-              <w:top w:type="dxa" w:w="60"/>
-              <w:left w:type="dxa" w:w="100"/>
-              <w:bottom w:type="dxa" w:w="60"/>
-              <w:right w:type="dxa" w:w="100"/>
-            </w:tcMar>
-            <w:vAlign w:val="top"/>
-          </w:tcPr>
-          <w:p>
-            <w:pPr>
-              <w:bidi/>
-              <w:spacing w:after="60" w:before="0" w:line="260"/>
-            </w:pPr>
-            <w:r>
-              <w:rPr>
-                <w:rFonts w:ascii="Arial" w:cs="Arial" w:hAnsi="Arial"/>
-                <w:b/>
-                <w:bCs/>
-                <w:color w:val="0B3C5D"/>
-                <w:sz w:val="20"/>
-                <w:szCs w:val="20"/>
-                <w:rtl/>
-              </w:rPr>
-              <w:t xml:space="preserve">C: Check – </w:t>
-            </w:r>
-            <w:r>
-              <w:rPr>
-                <w:rFonts w:ascii="Arial" w:cs="Arial" w:hAnsi="Arial"/>
-                <w:b/>
-                <w:bCs/>
-                <w:color w:val="0B3C5D"/>
-                <w:sz w:val="20"/>
-                <w:szCs w:val="20"/>
-                <w:rtl/>
-              </w:rPr>
-              <w:t xml:space="preserve">متابعة وتقييم التنفيذ</w:t>
-            </w:r>
-          </w:p>
-          <w:p>
-            <w:pPr>
-              <w:bidi/>
-              <w:spacing w:after="60" w:before="0" w:line="260"/>
-              <w:jc w:val="both"/>
-            </w:pPr>
-            <w:r>
-              <w:rPr>
-                <w:rFonts w:ascii="Arial" w:cs="Arial" w:hAnsi="Arial"/>
-                <w:b/>
-                <w:bCs/>
-                <w:color w:val="0E8A8A"/>
-                <w:sz w:val="18"/>
-                <w:szCs w:val="18"/>
-                <w:rtl/>
-              </w:rPr>
-              <w:t xml:space="preserve">الوصف: </w:t>
-            </w:r>
-            <w:r>
-              <w:rPr>
-                <w:rFonts w:ascii="Arial" w:cs="Arial" w:hAnsi="Arial"/>
-                <w:color w:val="1D2B36"/>
-                <w:sz w:val="18"/>
-                <w:szCs w:val="18"/>
-                <w:rtl/>
-              </w:rPr>
-              <w:t xml:space="preserve">قيس الأثر على مستوى «التعلّم» (المستوى الثاني في نموذج Kirkpatrick) عبر </w:t>
-            </w:r>
-            <w:r>
-              <w:rPr>
-                <w:rFonts w:ascii="Arial" w:cs="Arial" w:hAnsi="Arial"/>
-                <w:b/>
-                <w:bCs/>
-                <w:color w:val="1D2B36"/>
-                <w:sz w:val="18"/>
-                <w:szCs w:val="18"/>
-                <w:rtl/>
-              </w:rPr>
-              <w:t xml:space="preserve">62 سجل تقييم مقترن</w:t>
-            </w:r>
-            <w:r>
-              <w:rPr>
-                <w:rFonts w:ascii="Arial" w:cs="Arial" w:hAnsi="Arial"/>
-                <w:color w:val="1D2B36"/>
-                <w:sz w:val="18"/>
-                <w:szCs w:val="18"/>
-                <w:rtl/>
-              </w:rPr>
-              <w:t xml:space="preserve">: ارتفع المتوسط المرجح من </w:t>
-            </w:r>
-            <w:r>
-              <w:rPr>
-                <w:rFonts w:ascii="Arial" w:cs="Arial" w:hAnsi="Arial"/>
-                <w:b/>
-                <w:bCs/>
-                <w:color w:val="1D2B36"/>
-                <w:sz w:val="18"/>
-                <w:szCs w:val="18"/>
-                <w:rtl/>
-              </w:rPr>
-              <w:t xml:space="preserve">78.45% إلى 90.66%</w:t>
-            </w:r>
-            <w:r>
-              <w:rPr>
-                <w:rFonts w:ascii="Arial" w:cs="Arial" w:hAnsi="Arial"/>
-                <w:color w:val="1D2B36"/>
-                <w:sz w:val="18"/>
-                <w:szCs w:val="18"/>
-                <w:rtl/>
-              </w:rPr>
-              <w:t xml:space="preserve"> (+12.21 نقطة مئوية؛ تحسّن نسبي 15.6%)، وبلغ متوسط الاختبار الورقي اللاحق للاحتفاظ بالمعلومات </w:t>
-            </w:r>
-            <w:r>
-              <w:rPr>
-                <w:rFonts w:ascii="Arial" w:cs="Arial" w:hAnsi="Arial"/>
-                <w:b/>
-                <w:bCs/>
-                <w:color w:val="1D2B36"/>
-                <w:sz w:val="18"/>
-                <w:szCs w:val="18"/>
-                <w:rtl/>
-              </w:rPr>
-              <w:t xml:space="preserve">85.68%</w:t>
-            </w:r>
-            <w:r>
-              <w:rPr>
-                <w:rFonts w:ascii="Arial" w:cs="Arial" w:hAnsi="Arial"/>
-                <w:color w:val="1D2B36"/>
-                <w:sz w:val="18"/>
-                <w:szCs w:val="18"/>
-                <w:rtl/>
-              </w:rPr>
-              <w:t xml:space="preserve"> (37 نتيجة). واستخدم المنصة </w:t>
-            </w:r>
-            <w:r>
-              <w:rPr>
-                <w:rFonts w:ascii="Arial" w:cs="Arial" w:hAnsi="Arial"/>
-                <w:b/>
-                <w:bCs/>
-                <w:color w:val="1D2B36"/>
-                <w:sz w:val="18"/>
-                <w:szCs w:val="18"/>
-                <w:rtl/>
-              </w:rPr>
-              <w:t xml:space="preserve">45 من 55 مستهدفًا (81.8%)</w:t>
-            </w:r>
-            <w:r>
-              <w:rPr>
-                <w:rFonts w:ascii="Arial" w:cs="Arial" w:hAnsi="Arial"/>
-                <w:color w:val="1D2B36"/>
-                <w:sz w:val="18"/>
-                <w:szCs w:val="18"/>
-                <w:rtl/>
-              </w:rPr>
-              <w:t xml:space="preserve">، وتحققت مستهدفات الخطة الأكاديمية للأرباع الثلاثة الأولى من 2026 بنسبة </w:t>
-            </w:r>
-            <w:r>
-              <w:rPr>
-                <w:rFonts w:ascii="Arial" w:cs="Arial" w:hAnsi="Arial"/>
-                <w:b/>
-                <w:bCs/>
-                <w:color w:val="1D2B36"/>
-                <w:sz w:val="18"/>
-                <w:szCs w:val="18"/>
-                <w:rtl/>
-              </w:rPr>
-              <w:t xml:space="preserve">100%</w:t>
-            </w:r>
-            <w:r>
-              <w:rPr>
-                <w:rFonts w:ascii="Arial" w:cs="Arial" w:hAnsi="Arial"/>
-                <w:color w:val="1D2B36"/>
-                <w:sz w:val="18"/>
-                <w:szCs w:val="18"/>
-                <w:rtl/>
-              </w:rPr>
-              <w:t xml:space="preserve"> مقابل خط أساس 69.60%.</w:t>
-            </w:r>
-          </w:p>
-          <w:p>
-            <w:pPr>
-              <w:bidi/>
-              <w:spacing w:after="0" w:before="0" w:line="260"/>
-            </w:pPr>
-            <w:r>
-              <w:rPr>
-                <w:rFonts w:ascii="Arial" w:cs="Arial" w:hAnsi="Arial"/>
-                <w:b/>
-                <w:bCs/>
-                <w:color w:val="0E8A8A"/>
-                <w:sz w:val="18"/>
-                <w:szCs w:val="18"/>
-                <w:rtl/>
-              </w:rPr>
-              <w:t xml:space="preserve">الأداة: </w:t>
-            </w:r>
-            <w:r>
-              <w:rPr>
-                <w:rFonts w:ascii="Arial" w:cs="Arial" w:hAnsi="Arial"/>
-                <w:b/>
-                <w:bCs/>
-                <w:color w:val="1D2B36"/>
-                <w:sz w:val="18"/>
-                <w:szCs w:val="18"/>
-                <w:rtl/>
-              </w:rPr>
-              <w:t xml:space="preserve">تحليل قبلي–بعدي (Pre–Post Analysis) + لوحة مؤشرات (KPI Dashboard) + مخطط التشغيل (Run Chart)</w:t>
             </w:r>
           </w:p>
         </w:tc>
@@ -3960,7 +3674,7 @@
                 <w:szCs w:val="20"/>
                 <w:rtl/>
               </w:rPr>
-              <w:t xml:space="preserve">A: Act – </w:t>
+              <w:t xml:space="preserve">C: Check – </w:t>
             </w:r>
             <w:r>
               <w:rPr>
@@ -3972,7 +3686,7 @@
                 <w:szCs w:val="20"/>
                 <w:rtl/>
               </w:rPr>
-              <w:t xml:space="preserve">تعميم التنفيذ والاستمرارية</w:t>
+              <w:t xml:space="preserve">متابعة وتقييم التنفيذ</w:t>
             </w:r>
           </w:p>
           <w:p>
@@ -4001,51 +3715,139 @@
                 <w:szCs w:val="18"/>
                 <w:rtl/>
               </w:rPr>
-              <w:t xml:space="preserve">يُحافَظ على التعلّم المدمج قناةً ثابتة للتدريب النظري في المراكز العشرة وفق </w:t>
-            </w:r>
-            <w:r>
-              <w:rPr>
-                <w:rFonts w:ascii="Arial" w:cs="Arial" w:hAnsi="Arial"/>
-                <w:b/>
-                <w:bCs/>
-                <w:color w:val="1D2B36"/>
-                <w:sz w:val="18"/>
-                <w:szCs w:val="18"/>
-                <w:rtl/>
-              </w:rPr>
-              <w:t xml:space="preserve">خطة ضبط</w:t>
-            </w:r>
-            <w:r>
-              <w:rPr>
-                <w:rFonts w:ascii="Arial" w:cs="Arial" w:hAnsi="Arial"/>
-                <w:color w:val="1D2B36"/>
-                <w:sz w:val="18"/>
-                <w:szCs w:val="18"/>
-                <w:rtl/>
-              </w:rPr>
-              <w:t xml:space="preserve"> تحدد لكل مؤشر تكرار المتابعة وحدّ التدخل؛ وأي انحراف يُطلق دورة PDCA جديدة. وتشمل الاستدامة: تحديث المحتوى وفق الأدلة الإرشادية، وتوظيف نتائج الاختبارات لتحديد الفجوات المعرفية وتوجيه الخطة التدريبية المقبلة. </w:t>
-            </w:r>
-            <w:r>
-              <w:rPr>
-                <w:rFonts w:ascii="Arial" w:cs="Arial" w:hAnsi="Arial"/>
-                <w:b/>
-                <w:bCs/>
-                <w:color w:val="1D2B36"/>
-                <w:sz w:val="18"/>
-                <w:szCs w:val="18"/>
-                <w:rtl/>
-              </w:rPr>
-              <w:t xml:space="preserve">فرص التعميم: </w:t>
-            </w:r>
-            <w:r>
-              <w:rPr>
-                <w:rFonts w:ascii="Arial" w:cs="Arial" w:hAnsi="Arial"/>
-                <w:color w:val="1D2B36"/>
-                <w:sz w:val="18"/>
-                <w:szCs w:val="18"/>
-                <w:rtl/>
-              </w:rPr>
-              <w:t xml:space="preserve">إدراج المحتوى ضمن تهيئة الموظفين الجدد، ونقل التجربة إلى قطاعات وفئات مهنية أخرى بالتجمع.</w:t>
+              <w:t xml:space="preserve">قيس الأثر على مستوى «التعلّم» (المستوى الثاني في نموذج Kirkpatrick) عبر </w:t>
+            </w:r>
+            <w:r>
+              <w:rPr>
+                <w:rFonts w:ascii="Arial" w:cs="Arial" w:hAnsi="Arial"/>
+                <w:b/>
+                <w:bCs/>
+                <w:color w:val="1D2B36"/>
+                <w:sz w:val="18"/>
+                <w:szCs w:val="18"/>
+                <w:rtl/>
+              </w:rPr>
+              <w:t xml:space="preserve">62 سجل تقييم مقترن</w:t>
+            </w:r>
+            <w:r>
+              <w:rPr>
+                <w:rFonts w:ascii="Arial" w:cs="Arial" w:hAnsi="Arial"/>
+                <w:color w:val="1D2B36"/>
+                <w:sz w:val="18"/>
+                <w:szCs w:val="18"/>
+                <w:rtl/>
+              </w:rPr>
+              <w:t xml:space="preserve">: ارتفع المتوسط المرجح من </w:t>
+            </w:r>
+            <w:r>
+              <w:rPr>
+                <w:rFonts w:ascii="Arial" w:cs="Arial" w:hAnsi="Arial"/>
+                <w:b/>
+                <w:bCs/>
+                <w:color w:val="1D2B36"/>
+                <w:sz w:val="18"/>
+                <w:szCs w:val="18"/>
+                <w:rtl/>
+              </w:rPr>
+              <w:t xml:space="preserve">78.45% إلى 90.66%</w:t>
+            </w:r>
+            <w:r>
+              <w:rPr>
+                <w:rFonts w:ascii="Arial" w:cs="Arial" w:hAnsi="Arial"/>
+                <w:color w:val="1D2B36"/>
+                <w:sz w:val="18"/>
+                <w:szCs w:val="18"/>
+                <w:rtl/>
+              </w:rPr>
+              <w:t xml:space="preserve"> (+12.21 نقطة مئوية؛ تحسّن نسبي 15.6%)، وبلغ متوسط الاختبار الورقي اللاحق للاحتفاظ بالمعلومات </w:t>
+            </w:r>
+            <w:r>
+              <w:rPr>
+                <w:rFonts w:ascii="Arial" w:cs="Arial" w:hAnsi="Arial"/>
+                <w:b/>
+                <w:bCs/>
+                <w:color w:val="1D2B36"/>
+                <w:sz w:val="18"/>
+                <w:szCs w:val="18"/>
+                <w:rtl/>
+              </w:rPr>
+              <w:t xml:space="preserve">85.68%</w:t>
+            </w:r>
+            <w:r>
+              <w:rPr>
+                <w:rFonts w:ascii="Arial" w:cs="Arial" w:hAnsi="Arial"/>
+                <w:color w:val="1D2B36"/>
+                <w:sz w:val="18"/>
+                <w:szCs w:val="18"/>
+                <w:rtl/>
+              </w:rPr>
+              <w:t xml:space="preserve"> (37 نتيجة). واستخدم المنصة </w:t>
+            </w:r>
+            <w:r>
+              <w:rPr>
+                <w:rFonts w:ascii="Arial" w:cs="Arial" w:hAnsi="Arial"/>
+                <w:b/>
+                <w:bCs/>
+                <w:color w:val="1D2B36"/>
+                <w:sz w:val="18"/>
+                <w:szCs w:val="18"/>
+                <w:rtl/>
+              </w:rPr>
+              <w:t xml:space="preserve">45 من 55 مستهدفًا (81.8%)</w:t>
+            </w:r>
+            <w:r>
+              <w:rPr>
+                <w:rFonts w:ascii="Arial" w:cs="Arial" w:hAnsi="Arial"/>
+                <w:color w:val="1D2B36"/>
+                <w:sz w:val="18"/>
+                <w:szCs w:val="18"/>
+                <w:rtl/>
+              </w:rPr>
+              <w:t xml:space="preserve">، وتحققت مستهدفات الخطة الأكاديمية للأرباع الثلاثة الأولى من 2026 بنسبة </w:t>
+            </w:r>
+            <w:r>
+              <w:rPr>
+                <w:rFonts w:ascii="Arial" w:cs="Arial" w:hAnsi="Arial"/>
+                <w:b/>
+                <w:bCs/>
+                <w:color w:val="1D2B36"/>
+                <w:sz w:val="18"/>
+                <w:szCs w:val="18"/>
+                <w:rtl/>
+              </w:rPr>
+              <w:t xml:space="preserve">100%</w:t>
+            </w:r>
+            <w:r>
+              <w:rPr>
+                <w:rFonts w:ascii="Arial" w:cs="Arial" w:hAnsi="Arial"/>
+                <w:color w:val="1D2B36"/>
+                <w:sz w:val="18"/>
+                <w:szCs w:val="18"/>
+                <w:rtl/>
+              </w:rPr>
+              <w:t xml:space="preserve"> مقابل خط أساس 69.60%. وقيس رضا المستخدمين باستبيان إلكتروني: </w:t>
+            </w:r>
+            <w:r>
+              <w:rPr>
+                <w:rFonts w:ascii="Arial" w:cs="Arial" w:hAnsi="Arial"/>
+                <w:b/>
+                <w:bCs/>
+                <w:color w:val="1D2B36"/>
+                <w:sz w:val="18"/>
+                <w:szCs w:val="18"/>
+                <w:rtl/>
+              </w:rPr>
+              <w:t xml:space="preserve">متوسط 4.73 من 5 (94.7%)</w:t>
+            </w:r>
+            <w:r>
+              <w:rPr>
+                <w:rFonts w:ascii="Arial" w:cs="Arial" w:hAnsi="Arial"/>
+                <w:color w:val="1D2B36"/>
+                <w:sz w:val="18"/>
+                <w:szCs w:val="18"/>
+                <w:rtl/>
+              </w:rPr>
+              <w:t xml:space="preserve">، وجميع الإجابات «موافق» أو «موافق بشدة» (6 ردود).</w:t>
             </w:r>
           </w:p>
           <w:p>
@@ -4075,7 +3877,7 @@
                 <w:szCs w:val="18"/>
                 <w:rtl/>
               </w:rPr>
-              <w:t xml:space="preserve">خطة الضبط (Control Plan) + التوحيد القياسي (Standardization)</w:t>
+              <w:t xml:space="preserve">تحليل قبلي–بعدي (Pre–Post) + لوحة مؤشرات (KPI Dashboard) + مخطط التشغيل (Run Chart) + استبيان رضا المستفيد</w:t>
             </w:r>
           </w:p>
         </w:tc>
@@ -4130,6 +3932,318 @@
                           <a:xfrm>
                             <a:off x="0" y="0"/>
                             <a:ext cx="2714625" cy="1695450"/>
+                          </a:xfrm>
+                          <a:prstGeom prst="rect">
+                            <a:avLst/>
+                          </a:prstGeom>
+                        </pic:spPr>
+                      </pic:pic>
+                    </a:graphicData>
+                  </a:graphic>
+                </wp:inline>
+              </w:drawing>
+            </w:r>
+          </w:p>
+        </w:tc>
+      </w:tr>
+      <w:tr>
+        <w:trPr>
+          <w:cantSplit/>
+        </w:trPr>
+        <w:tc>
+          <w:tcPr>
+            <w:tcW w:type="dxa" w:w="5906"/>
+            <w:tcBorders>
+              <w:top w:val="single" w:color="7F9DB5" w:sz="6"/>
+              <w:left w:val="single" w:color="7F9DB5" w:sz="6"/>
+              <w:bottom w:val="single" w:color="7F9DB5" w:sz="6"/>
+              <w:right w:val="single" w:color="7F9DB5" w:sz="6"/>
+            </w:tcBorders>
+            <w:tcMar>
+              <w:top w:type="dxa" w:w="60"/>
+              <w:left w:type="dxa" w:w="100"/>
+              <w:bottom w:type="dxa" w:w="60"/>
+              <w:right w:type="dxa" w:w="100"/>
+            </w:tcMar>
+            <w:vAlign w:val="top"/>
+          </w:tcPr>
+          <w:p>
+            <w:pPr>
+              <w:bidi/>
+              <w:spacing w:after="60" w:before="0" w:line="260"/>
+            </w:pPr>
+            <w:r>
+              <w:rPr>
+                <w:rFonts w:ascii="Arial" w:cs="Arial" w:hAnsi="Arial"/>
+                <w:b/>
+                <w:bCs/>
+                <w:color w:val="0B3C5D"/>
+                <w:sz w:val="20"/>
+                <w:szCs w:val="20"/>
+                <w:rtl/>
+              </w:rPr>
+              <w:t xml:space="preserve">A: Act – </w:t>
+            </w:r>
+            <w:r>
+              <w:rPr>
+                <w:rFonts w:ascii="Arial" w:cs="Arial" w:hAnsi="Arial"/>
+                <w:b/>
+                <w:bCs/>
+                <w:color w:val="0B3C5D"/>
+                <w:sz w:val="20"/>
+                <w:szCs w:val="20"/>
+                <w:rtl/>
+              </w:rPr>
+              <w:t xml:space="preserve">تعميم التنفيذ والاستمرارية</w:t>
+            </w:r>
+          </w:p>
+          <w:p>
+            <w:pPr>
+              <w:bidi/>
+              <w:spacing w:after="60" w:before="0" w:line="260"/>
+              <w:jc w:val="both"/>
+            </w:pPr>
+            <w:r>
+              <w:rPr>
+                <w:rFonts w:ascii="Arial" w:cs="Arial" w:hAnsi="Arial"/>
+                <w:b/>
+                <w:bCs/>
+                <w:color w:val="0E8A8A"/>
+                <w:sz w:val="18"/>
+                <w:szCs w:val="18"/>
+                <w:rtl/>
+              </w:rPr>
+              <w:t xml:space="preserve">الوصف: </w:t>
+            </w:r>
+            <w:r>
+              <w:rPr>
+                <w:rFonts w:ascii="Arial" w:cs="Arial" w:hAnsi="Arial"/>
+                <w:color w:val="1D2B36"/>
+                <w:sz w:val="18"/>
+                <w:szCs w:val="18"/>
+                <w:rtl/>
+              </w:rPr>
+              <w:t xml:space="preserve">يُحافَظ على التعلّم المدمج قناةً ثابتة للتدريب النظري في المراكز العشرة وفق </w:t>
+            </w:r>
+            <w:r>
+              <w:rPr>
+                <w:rFonts w:ascii="Arial" w:cs="Arial" w:hAnsi="Arial"/>
+                <w:b/>
+                <w:bCs/>
+                <w:color w:val="1D2B36"/>
+                <w:sz w:val="18"/>
+                <w:szCs w:val="18"/>
+                <w:rtl/>
+              </w:rPr>
+              <w:t xml:space="preserve">خطة ضبط</w:t>
+            </w:r>
+            <w:r>
+              <w:rPr>
+                <w:rFonts w:ascii="Arial" w:cs="Arial" w:hAnsi="Arial"/>
+                <w:color w:val="1D2B36"/>
+                <w:sz w:val="18"/>
+                <w:szCs w:val="18"/>
+                <w:rtl/>
+              </w:rPr>
+              <w:t xml:space="preserve"> تحدد لكل مؤشر تكرار المتابعة وحدّ التدخل؛ وأي انحراف يُطلق دورة PDCA جديدة. وتشمل الاستدامة: تحديث المحتوى وفق الأدلة الإرشادية، وتوظيف نتائج الاختبارات لتحديد الفجوات المعرفية وتوجيه الخطة التدريبية المقبلة. </w:t>
+            </w:r>
+            <w:r>
+              <w:rPr>
+                <w:rFonts w:ascii="Arial" w:cs="Arial" w:hAnsi="Arial"/>
+                <w:b/>
+                <w:bCs/>
+                <w:color w:val="1D2B36"/>
+                <w:sz w:val="18"/>
+                <w:szCs w:val="18"/>
+                <w:rtl/>
+              </w:rPr>
+              <w:t xml:space="preserve">الدورة التالية (PDCA 2): </w:t>
+            </w:r>
+            <w:r>
+              <w:rPr>
+                <w:rFonts w:ascii="Arial" w:cs="Arial" w:hAnsi="Arial"/>
+                <w:color w:val="1D2B36"/>
+                <w:sz w:val="18"/>
+                <w:szCs w:val="18"/>
+                <w:rtl/>
+              </w:rPr>
+              <w:t xml:space="preserve">معالجة ملاحظات المستخدمين (استئناف الفيديو، وسرعة التحميل، ووحدات تعلّم مصغّر)، وإضافة محتوى للموضوعات الأدنى إنجازًا في 2025 وأولها علم الأدوية وإعطاؤها (11%) الذي طلبه المستخدمون أيضًا، ومعايرة المستهدفات لتجنّب الموضوعات ذات المستهدف الصفري (25 موضوعًا في 2025). </w:t>
+            </w:r>
+            <w:r>
+              <w:rPr>
+                <w:rFonts w:ascii="Arial" w:cs="Arial" w:hAnsi="Arial"/>
+                <w:b/>
+                <w:bCs/>
+                <w:color w:val="1D2B36"/>
+                <w:sz w:val="18"/>
+                <w:szCs w:val="18"/>
+                <w:rtl/>
+              </w:rPr>
+              <w:t xml:space="preserve">فرص التعميم: </w:t>
+            </w:r>
+            <w:r>
+              <w:rPr>
+                <w:rFonts w:ascii="Arial" w:cs="Arial" w:hAnsi="Arial"/>
+                <w:color w:val="1D2B36"/>
+                <w:sz w:val="18"/>
+                <w:szCs w:val="18"/>
+                <w:rtl/>
+              </w:rPr>
+              <w:t xml:space="preserve">إدراج المحتوى ضمن تهيئة الموظفين الجدد، ونقل التجربة إلى قطاعات وفئات مهنية أخرى بالتجمع.</w:t>
+            </w:r>
+          </w:p>
+          <w:p>
+            <w:pPr>
+              <w:bidi/>
+              <w:spacing w:after="0" w:before="0" w:line="260"/>
+            </w:pPr>
+            <w:r>
+              <w:rPr>
+                <w:rFonts w:ascii="Arial" w:cs="Arial" w:hAnsi="Arial"/>
+                <w:b/>
+                <w:bCs/>
+                <w:color w:val="0E8A8A"/>
+                <w:sz w:val="18"/>
+                <w:szCs w:val="18"/>
+                <w:rtl/>
+              </w:rPr>
+              <w:t xml:space="preserve">الأداة: </w:t>
+            </w:r>
+            <w:r>
+              <w:rPr>
+                <w:rFonts w:ascii="Arial" w:cs="Arial" w:hAnsi="Arial"/>
+                <w:b/>
+                <w:bCs/>
+                <w:color w:val="1D2B36"/>
+                <w:sz w:val="18"/>
+                <w:szCs w:val="18"/>
+                <w:rtl/>
+              </w:rPr>
+              <w:t xml:space="preserve">خطة الضبط (Control Plan) + التوحيد القياسي (Standardization)</w:t>
+            </w:r>
+          </w:p>
+        </w:tc>
+        <w:tc>
+          <w:tcPr>
+            <w:tcW w:type="dxa" w:w="4400"/>
+            <w:tcBorders>
+              <w:top w:val="single" w:color="7F9DB5" w:sz="6"/>
+              <w:left w:val="single" w:color="7F9DB5" w:sz="6"/>
+              <w:bottom w:val="single" w:color="7F9DB5" w:sz="6"/>
+              <w:right w:val="single" w:color="7F9DB5" w:sz="6"/>
+            </w:tcBorders>
+            <w:tcMar>
+              <w:top w:type="dxa" w:w="60"/>
+              <w:left w:type="dxa" w:w="100"/>
+              <w:bottom w:type="dxa" w:w="60"/>
+              <w:right w:type="dxa" w:w="100"/>
+            </w:tcMar>
+            <w:vAlign w:val="center"/>
+          </w:tcPr>
+          <w:p>
+            <w:pPr>
+              <w:spacing w:after="0"/>
+              <w:jc w:val="center"/>
+            </w:pPr>
+            <w:r>
+              <w:drawing>
+                <wp:inline distT="0" distB="0" distL="0" distR="0">
+                  <wp:extent cx="2714625" cy="1695450"/>
+                  <wp:effectExtent t="0" r="0" b="0" l="0"/>
+                  <wp:docPr id="1" name="" descr="" title=""/>
+                  <wp:cNvGraphicFramePr>
+                    <a:graphicFrameLocks xmlns:a="http://schemas.openxmlformats.org/drawingml/2006/main" noChangeAspect="1"/>
+                  </wp:cNvGraphicFramePr>
+                  <a:graphic xmlns:a="http://schemas.openxmlformats.org/drawingml/2006/main">
+                    <a:graphicData uri="http://schemas.openxmlformats.org/drawingml/2006/picture">
+                      <pic:pic xmlns:pic="http://schemas.openxmlformats.org/drawingml/2006/picture">
+                        <pic:nvPicPr>
+                          <pic:cNvPr id="0" name="" descr=""/>
+                          <pic:cNvPicPr>
+                            <a:picLocks noChangeAspect="1" noChangeArrowheads="1"/>
+                          </pic:cNvPicPr>
+                        </pic:nvPicPr>
+                        <pic:blipFill>
+                          <a:blip r:embed="rId18" cstate="none"/>
+                          <a:srcRect/>
+                          <a:stretch>
+                            <a:fillRect/>
+                          </a:stretch>
+                        </pic:blipFill>
+                        <pic:spPr bwMode="auto">
+                          <a:xfrm>
+                            <a:off x="0" y="0"/>
+                            <a:ext cx="2714625" cy="1695450"/>
+                          </a:xfrm>
+                          <a:prstGeom prst="rect">
+                            <a:avLst/>
+                          </a:prstGeom>
+                        </pic:spPr>
+                      </pic:pic>
+                    </a:graphicData>
+                  </a:graphic>
+                </wp:inline>
+              </w:drawing>
+            </w:r>
+          </w:p>
+        </w:tc>
+      </w:tr>
+      <w:tr>
+        <w:trPr>
+          <w:cantSplit/>
+        </w:trPr>
+        <w:tc>
+          <w:tcPr>
+            <w:tcW w:type="dxa" w:w="10306"/>
+            <w:gridSpan w:val="2"/>
+            <w:tcBorders>
+              <w:top w:val="single" w:color="7F9DB5" w:sz="6"/>
+              <w:left w:val="single" w:color="7F9DB5" w:sz="6"/>
+              <w:bottom w:val="single" w:color="7F9DB5" w:sz="6"/>
+              <w:right w:val="single" w:color="7F9DB5" w:sz="6"/>
+            </w:tcBorders>
+            <w:tcMar>
+              <w:top w:type="dxa" w:w="60"/>
+              <w:left w:type="dxa" w:w="100"/>
+              <w:bottom w:type="dxa" w:w="60"/>
+              <w:right w:type="dxa" w:w="100"/>
+            </w:tcMar>
+            <w:vAlign w:val="top"/>
+          </w:tcPr>
+          <w:p>
+            <w:pPr>
+              <w:spacing w:after="0"/>
+              <w:jc w:val="center"/>
+            </w:pPr>
+            <w:r>
+              <w:drawing>
+                <wp:inline distT="0" distB="0" distL="0" distR="0">
+                  <wp:extent cx="6191250" cy="2209800"/>
+                  <wp:effectExtent t="0" r="0" b="0" l="0"/>
+                  <wp:docPr id="1" name="" descr="" title=""/>
+                  <wp:cNvGraphicFramePr>
+                    <a:graphicFrameLocks xmlns:a="http://schemas.openxmlformats.org/drawingml/2006/main" noChangeAspect="1"/>
+                  </wp:cNvGraphicFramePr>
+                  <a:graphic xmlns:a="http://schemas.openxmlformats.org/drawingml/2006/main">
+                    <a:graphicData uri="http://schemas.openxmlformats.org/drawingml/2006/picture">
+                      <pic:pic xmlns:pic="http://schemas.openxmlformats.org/drawingml/2006/picture">
+                        <pic:nvPicPr>
+                          <pic:cNvPr id="0" name="" descr=""/>
+                          <pic:cNvPicPr>
+                            <a:picLocks noChangeAspect="1" noChangeArrowheads="1"/>
+                          </pic:cNvPicPr>
+                        </pic:nvPicPr>
+                        <pic:blipFill>
+                          <a:blip r:embed="rId19" cstate="none"/>
+                          <a:srcRect/>
+                          <a:stretch>
+                            <a:fillRect/>
+                          </a:stretch>
+                        </pic:blipFill>
+                        <pic:spPr bwMode="auto">
+                          <a:xfrm>
+                            <a:off x="0" y="0"/>
+                            <a:ext cx="6191250" cy="2209800"/>
                           </a:xfrm>
                           <a:prstGeom prst="rect">
                             <a:avLst/>
@@ -4608,7 +4722,7 @@
                           </pic:cNvPicPr>
                         </pic:nvPicPr>
                         <pic:blipFill>
-                          <a:blip r:embed="rId18" cstate="none"/>
+                          <a:blip r:embed="rId20" cstate="none"/>
                           <a:srcRect/>
                           <a:stretch>
                             <a:fillRect/>
@@ -4657,7 +4771,7 @@
           <w:tbl>
             <w:tblPr>
               <w:bidiVisual/>
-              <w:tblW w:type="dxa" w:w="10306"/>
+              <w:tblW w:type="dxa" w:w="10086"/>
               <w:tblBorders>
                 <w:top w:val="single" w:color="auto" w:sz="4"/>
                 <w:left w:val="single" w:color="auto" w:sz="4"/>
@@ -4668,7 +4782,7 @@
               </w:tblBorders>
             </w:tblPr>
             <w:tblGrid>
-              <w:gridCol w:w="2400"/>
+              <w:gridCol w:w="2180"/>
               <w:gridCol w:w="1250"/>
               <w:gridCol w:w="1250"/>
               <w:gridCol w:w="1250"/>
@@ -4682,7 +4796,7 @@
               </w:trPr>
               <w:tc>
                 <w:tcPr>
-                  <w:tcW w:type="dxa" w:w="2400"/>
+                  <w:tcW w:type="dxa" w:w="2180"/>
                   <w:tcBorders>
                     <w:top w:val="single" w:color="7F9DB5" w:sz="6"/>
                     <w:left w:val="single" w:color="7F9DB5" w:sz="6"/>
@@ -4915,7 +5029,7 @@
               </w:trPr>
               <w:tc>
                 <w:tcPr>
-                  <w:tcW w:type="dxa" w:w="2400"/>
+                  <w:tcW w:type="dxa" w:w="2180"/>
                   <w:tcBorders>
                     <w:top w:val="single" w:color="7F9DB5" w:sz="6"/>
                     <w:left w:val="single" w:color="7F9DB5" w:sz="6"/>
@@ -5153,7 +5267,7 @@
               </w:trPr>
               <w:tc>
                 <w:tcPr>
-                  <w:tcW w:type="dxa" w:w="2400"/>
+                  <w:tcW w:type="dxa" w:w="2180"/>
                   <w:tcBorders>
                     <w:top w:val="single" w:color="7F9DB5" w:sz="6"/>
                     <w:left w:val="single" w:color="7F9DB5" w:sz="6"/>
@@ -5391,7 +5505,7 @@
               </w:trPr>
               <w:tc>
                 <w:tcPr>
-                  <w:tcW w:type="dxa" w:w="2400"/>
+                  <w:tcW w:type="dxa" w:w="2180"/>
                   <w:tcBorders>
                     <w:top w:val="single" w:color="7F9DB5" w:sz="6"/>
                     <w:left w:val="single" w:color="7F9DB5" w:sz="6"/>
@@ -5629,7 +5743,7 @@
               </w:trPr>
               <w:tc>
                 <w:tcPr>
-                  <w:tcW w:type="dxa" w:w="2400"/>
+                  <w:tcW w:type="dxa" w:w="2180"/>
                   <w:tcBorders>
                     <w:top w:val="single" w:color="7F9DB5" w:sz="6"/>
                     <w:left w:val="single" w:color="7F9DB5" w:sz="6"/>
@@ -5867,7 +5981,245 @@
               </w:trPr>
               <w:tc>
                 <w:tcPr>
-                  <w:tcW w:type="dxa" w:w="2400"/>
+                  <w:tcW w:type="dxa" w:w="2180"/>
+                  <w:tcBorders>
+                    <w:top w:val="single" w:color="7F9DB5" w:sz="6"/>
+                    <w:left w:val="single" w:color="7F9DB5" w:sz="6"/>
+                    <w:bottom w:val="single" w:color="7F9DB5" w:sz="6"/>
+                    <w:right w:val="single" w:color="7F9DB5" w:sz="6"/>
+                  </w:tcBorders>
+                  <w:tcMar>
+                    <w:top w:type="dxa" w:w="60"/>
+                    <w:left w:type="dxa" w:w="100"/>
+                    <w:bottom w:type="dxa" w:w="60"/>
+                    <w:right w:type="dxa" w:w="100"/>
+                  </w:tcMar>
+                  <w:vAlign w:val="center"/>
+                </w:tcPr>
+                <w:p>
+                  <w:pPr>
+                    <w:bidi/>
+                    <w:spacing w:after="0" w:before="0" w:line="260"/>
+                  </w:pPr>
+                  <w:r>
+                    <w:rPr>
+                      <w:rFonts w:ascii="Arial" w:cs="Arial" w:hAnsi="Arial"/>
+                      <w:b/>
+                      <w:bCs/>
+                      <w:color w:val="0B3C5D"/>
+                      <w:sz w:val="17"/>
+                      <w:szCs w:val="17"/>
+                      <w:rtl/>
+                    </w:rPr>
+                    <w:t xml:space="preserve">رضا المستخدمين عن المنصة</w:t>
+                  </w:r>
+                </w:p>
+              </w:tc>
+              <w:tc>
+                <w:tcPr>
+                  <w:tcW w:type="dxa" w:w="1250"/>
+                  <w:tcBorders>
+                    <w:top w:val="single" w:color="7F9DB5" w:sz="6"/>
+                    <w:left w:val="single" w:color="7F9DB5" w:sz="6"/>
+                    <w:bottom w:val="single" w:color="7F9DB5" w:sz="6"/>
+                    <w:right w:val="single" w:color="7F9DB5" w:sz="6"/>
+                  </w:tcBorders>
+                  <w:tcMar>
+                    <w:top w:type="dxa" w:w="60"/>
+                    <w:left w:type="dxa" w:w="100"/>
+                    <w:bottom w:type="dxa" w:w="60"/>
+                    <w:right w:type="dxa" w:w="100"/>
+                  </w:tcMar>
+                  <w:vAlign w:val="center"/>
+                </w:tcPr>
+                <w:p>
+                  <w:pPr>
+                    <w:bidi/>
+                    <w:spacing w:after="0" w:before="0" w:line="260"/>
+                    <w:jc w:val="center"/>
+                  </w:pPr>
+                  <w:r>
+                    <w:rPr>
+                      <w:rFonts w:ascii="Arial" w:cs="Arial" w:hAnsi="Arial"/>
+                      <w:color w:val="1D2B36"/>
+                      <w:sz w:val="17"/>
+                      <w:szCs w:val="17"/>
+                      <w:rtl/>
+                    </w:rPr>
+                    <w:t xml:space="preserve">غير مُقاس</w:t>
+                  </w:r>
+                </w:p>
+              </w:tc>
+              <w:tc>
+                <w:tcPr>
+                  <w:tcW w:type="dxa" w:w="1250"/>
+                  <w:tcBorders>
+                    <w:top w:val="single" w:color="7F9DB5" w:sz="6"/>
+                    <w:left w:val="single" w:color="7F9DB5" w:sz="6"/>
+                    <w:bottom w:val="single" w:color="7F9DB5" w:sz="6"/>
+                    <w:right w:val="single" w:color="7F9DB5" w:sz="6"/>
+                  </w:tcBorders>
+                  <w:tcMar>
+                    <w:top w:type="dxa" w:w="60"/>
+                    <w:left w:type="dxa" w:w="100"/>
+                    <w:bottom w:type="dxa" w:w="60"/>
+                    <w:right w:type="dxa" w:w="100"/>
+                  </w:tcMar>
+                  <w:vAlign w:val="center"/>
+                </w:tcPr>
+                <w:p>
+                  <w:pPr>
+                    <w:bidi/>
+                    <w:spacing w:after="0" w:before="0" w:line="260"/>
+                    <w:jc w:val="center"/>
+                  </w:pPr>
+                  <w:r>
+                    <w:rPr>
+                      <w:rFonts w:ascii="Arial" w:cs="Arial" w:hAnsi="Arial"/>
+                      <w:color w:val="1D2B36"/>
+                      <w:sz w:val="17"/>
+                      <w:szCs w:val="17"/>
+                      <w:rtl/>
+                    </w:rPr>
+                    <w:t xml:space="preserve">—</w:t>
+                  </w:r>
+                </w:p>
+              </w:tc>
+              <w:tc>
+                <w:tcPr>
+                  <w:tcW w:type="dxa" w:w="1250"/>
+                  <w:tcBorders>
+                    <w:top w:val="single" w:color="7F9DB5" w:sz="6"/>
+                    <w:left w:val="single" w:color="7F9DB5" w:sz="6"/>
+                    <w:bottom w:val="single" w:color="7F9DB5" w:sz="6"/>
+                    <w:right w:val="single" w:color="7F9DB5" w:sz="6"/>
+                  </w:tcBorders>
+                  <w:tcMar>
+                    <w:top w:type="dxa" w:w="60"/>
+                    <w:left w:type="dxa" w:w="100"/>
+                    <w:bottom w:type="dxa" w:w="60"/>
+                    <w:right w:type="dxa" w:w="100"/>
+                  </w:tcMar>
+                  <w:vAlign w:val="center"/>
+                </w:tcPr>
+                <w:p>
+                  <w:pPr>
+                    <w:bidi/>
+                    <w:spacing w:after="0" w:before="0" w:line="260"/>
+                    <w:jc w:val="center"/>
+                  </w:pPr>
+                  <w:r>
+                    <w:rPr>
+                      <w:rFonts w:ascii="Arial" w:cs="Arial" w:hAnsi="Arial"/>
+                      <w:b/>
+                      <w:bCs/>
+                      <w:color w:val="0E8A8A"/>
+                      <w:sz w:val="17"/>
+                      <w:szCs w:val="17"/>
+                      <w:rtl/>
+                    </w:rPr>
+                    <w:t xml:space="preserve">4.73 من 5</w:t>
+                  </w:r>
+                </w:p>
+              </w:tc>
+              <w:tc>
+                <w:tcPr>
+                  <w:tcW w:type="dxa" w:w="1356"/>
+                  <w:tcBorders>
+                    <w:top w:val="single" w:color="7F9DB5" w:sz="6"/>
+                    <w:left w:val="single" w:color="7F9DB5" w:sz="6"/>
+                    <w:bottom w:val="single" w:color="7F9DB5" w:sz="6"/>
+                    <w:right w:val="single" w:color="7F9DB5" w:sz="6"/>
+                  </w:tcBorders>
+                  <w:tcMar>
+                    <w:top w:type="dxa" w:w="60"/>
+                    <w:left w:type="dxa" w:w="100"/>
+                    <w:bottom w:type="dxa" w:w="60"/>
+                    <w:right w:type="dxa" w:w="100"/>
+                  </w:tcMar>
+                  <w:vAlign w:val="center"/>
+                </w:tcPr>
+                <w:p>
+                  <w:pPr>
+                    <w:bidi/>
+                    <w:spacing w:after="0" w:before="0" w:line="260"/>
+                    <w:jc w:val="center"/>
+                  </w:pPr>
+                  <w:r>
+                    <w:rPr>
+                      <w:rFonts w:ascii="Arial" w:cs="Arial" w:hAnsi="Arial"/>
+                      <w:b/>
+                      <w:bCs/>
+                      <w:color w:val="1D2B36"/>
+                      <w:sz w:val="17"/>
+                      <w:szCs w:val="17"/>
+                      <w:rtl/>
+                    </w:rPr>
+                    <w:t xml:space="preserve">94.7%</w:t>
+                  </w:r>
+                </w:p>
+              </w:tc>
+              <w:tc>
+                <w:tcPr>
+                  <w:tcW w:type="dxa" w:w="2800"/>
+                  <w:tcBorders>
+                    <w:top w:val="single" w:color="7F9DB5" w:sz="6"/>
+                    <w:left w:val="single" w:color="7F9DB5" w:sz="6"/>
+                    <w:bottom w:val="single" w:color="7F9DB5" w:sz="6"/>
+                    <w:right w:val="single" w:color="7F9DB5" w:sz="6"/>
+                  </w:tcBorders>
+                  <w:shd w:fill="EAF4FA" w:color="auto" w:val="clear"/>
+                  <w:tcMar>
+                    <w:top w:type="dxa" w:w="60"/>
+                    <w:left w:type="dxa" w:w="100"/>
+                    <w:bottom w:type="dxa" w:w="60"/>
+                    <w:right w:type="dxa" w:w="100"/>
+                  </w:tcMar>
+                  <w:vAlign w:val="center"/>
+                </w:tcPr>
+                <w:p>
+                  <w:pPr>
+                    <w:bidi/>
+                    <w:spacing w:after="0" w:before="0" w:line="260"/>
+                  </w:pPr>
+                  <w:r>
+                    <w:rPr>
+                      <w:rFonts w:ascii="Arial" w:cs="Arial" w:hAnsi="Arial"/>
+                      <w:b/>
+                      <w:bCs/>
+                      <w:color w:val="0B3C5D"/>
+                      <w:sz w:val="17"/>
+                      <w:szCs w:val="17"/>
+                      <w:rtl/>
+                    </w:rPr>
+                    <w:t xml:space="preserve">☑ مؤشر داعم</w:t>
+                  </w:r>
+                </w:p>
+                <w:p>
+                  <w:pPr>
+                    <w:bidi/>
+                    <w:spacing w:after="0" w:before="0" w:line="260"/>
+                  </w:pPr>
+                  <w:r>
+                    <w:rPr>
+                      <w:rFonts w:ascii="Arial" w:cs="Arial" w:hAnsi="Arial"/>
+                      <w:color w:val="5B6E7C"/>
+                      <w:sz w:val="15"/>
+                      <w:szCs w:val="15"/>
+                      <w:rtl/>
+                    </w:rPr>
+                    <w:t xml:space="preserve">6 ردود؛ 100% موافق أو موافق بشدة</w:t>
+                  </w:r>
+                </w:p>
+              </w:tc>
+            </w:tr>
+            <w:tr>
+              <w:trPr>
+                <w:cantSplit/>
+              </w:trPr>
+              <w:tc>
+                <w:tcPr>
+                  <w:tcW w:type="dxa" w:w="2180"/>
                   <w:tcBorders>
                     <w:top w:val="single" w:color="7F9DB5" w:sz="6"/>
                     <w:left w:val="single" w:color="7F9DB5" w:sz="6"/>
@@ -6004,7 +6356,7 @@
                       <w:szCs w:val="17"/>
                       <w:rtl/>
                     </w:rPr>
-                    <w:t xml:space="preserve">12 / 10</w:t>
+                    <w:t xml:space="preserve">12 موضوعًا · 10 مراكز</w:t>
                   </w:r>
                 </w:p>
               </w:tc>
@@ -6345,7 +6697,7 @@
                 <w:szCs w:val="16"/>
                 <w:rtl/>
               </w:rPr>
-              <w:t xml:space="preserve"> – إلغاء إعادة المحاضرات والتنسيق المتكرر</w:t>
+              <w:t xml:space="preserve"> – نصف جلسات 2025 كانت تكرارًا يُغني عنه المحتوى المسجّل</w:t>
             </w:r>
           </w:p>
           <w:p>
@@ -6425,7 +6777,7 @@
                 <w:szCs w:val="16"/>
                 <w:rtl/>
               </w:rPr>
-              <w:t xml:space="preserve"> قياس منهجي لأثر التعلّم · قابلية التعميم</w:t>
+              <w:t xml:space="preserve"> رضا المستخدمين 94.7% · قياس منهجي لأثر التعلّم · قابلية التعميم</w:t>
             </w:r>
           </w:p>
         </w:tc>
@@ -6501,6 +6853,186 @@
                 <w:rtl/>
               </w:rPr>
               <w:t xml:space="preserve">؛ إذ القيمة = النتائج المتحققة ÷ تكلفة تحقيقها (Porter, 2010). فقد ارتفعت النتائج (إنجاز 100% وتحسّن معرفي +12.21 ن.م) مع خفض الجهد التشغيلي المتكرر، لأن المحتوى المسجّل يُنتَج مرة واحدة ويُعاد استخدامه دون تفريغ الكادر من المناوبات.</w:t>
+            </w:r>
+          </w:p>
+        </w:tc>
+      </w:tr>
+      <w:tr>
+        <w:trPr>
+          <w:cantSplit/>
+        </w:trPr>
+        <w:tc>
+          <w:tcPr>
+            <w:tcW w:type="dxa" w:w="5906"/>
+            <w:tcBorders>
+              <w:top w:val="single" w:color="7F9DB5" w:sz="6"/>
+              <w:left w:val="single" w:color="7F9DB5" w:sz="6"/>
+              <w:bottom w:val="single" w:color="7F9DB5" w:sz="6"/>
+              <w:right w:val="single" w:color="7F9DB5" w:sz="6"/>
+            </w:tcBorders>
+            <w:tcMar>
+              <w:top w:type="dxa" w:w="60"/>
+              <w:left w:type="dxa" w:w="100"/>
+              <w:bottom w:type="dxa" w:w="60"/>
+              <w:right w:type="dxa" w:w="100"/>
+            </w:tcMar>
+            <w:vAlign w:val="top"/>
+          </w:tcPr>
+          <w:p>
+            <w:pPr>
+              <w:bidi/>
+              <w:spacing w:after="60" w:before="0" w:line="260"/>
+            </w:pPr>
+            <w:r>
+              <w:rPr>
+                <w:rFonts w:ascii="Arial" w:cs="Arial" w:hAnsi="Arial"/>
+                <w:b/>
+                <w:bCs/>
+                <w:color w:val="0B3C5D"/>
+                <w:sz w:val="20"/>
+                <w:szCs w:val="20"/>
+                <w:rtl/>
+              </w:rPr>
+              <w:t xml:space="preserve">صوت المستفيد (Voice of the Customer)</w:t>
+            </w:r>
+          </w:p>
+          <w:p>
+            <w:pPr>
+              <w:bidi/>
+              <w:spacing w:after="40" w:before="0" w:line="260"/>
+              <w:jc w:val="both"/>
+            </w:pPr>
+            <w:r>
+              <w:rPr>
+                <w:rFonts w:ascii="Arial" w:cs="Arial" w:hAnsi="Arial"/>
+                <w:color w:val="1D2B36"/>
+                <w:sz w:val="18"/>
+                <w:szCs w:val="18"/>
+                <w:rtl/>
+              </w:rPr>
+              <w:t xml:space="preserve">قيّم المستخدمون المنصة في خمسة محاور بمتوسط عام </w:t>
+            </w:r>
+            <w:r>
+              <w:rPr>
+                <w:rFonts w:ascii="Arial" w:cs="Arial" w:hAnsi="Arial"/>
+                <w:b/>
+                <w:bCs/>
+                <w:color w:val="1D2B36"/>
+                <w:sz w:val="18"/>
+                <w:szCs w:val="18"/>
+                <w:rtl/>
+              </w:rPr>
+              <w:t xml:space="preserve">4.73 من 5</w:t>
+            </w:r>
+            <w:r>
+              <w:rPr>
+                <w:rFonts w:ascii="Arial" w:cs="Arial" w:hAnsi="Arial"/>
+                <w:color w:val="1D2B36"/>
+                <w:sz w:val="18"/>
+                <w:szCs w:val="18"/>
+                <w:rtl/>
+              </w:rPr>
+              <w:t xml:space="preserve">، وكانت جميع الإجابات «موافق» أو «موافق بشدة»، وحصل وضوح التصميم على الدرجة الكاملة (5.00).</w:t>
+            </w:r>
+          </w:p>
+          <w:p>
+            <w:pPr>
+              <w:bidi/>
+              <w:spacing w:after="40" w:before="0" w:line="260"/>
+              <w:jc w:val="both"/>
+            </w:pPr>
+            <w:r>
+              <w:rPr>
+                <w:rFonts w:ascii="Arial" w:cs="Arial" w:hAnsi="Arial"/>
+                <w:b/>
+                <w:bCs/>
+                <w:color w:val="0E8A8A"/>
+                <w:sz w:val="18"/>
+                <w:szCs w:val="18"/>
+                <w:rtl/>
+              </w:rPr>
+              <w:t xml:space="preserve">«سهّلت علينا حضور المحاضرات في الأوقات التي تناسبنا حتى نركّز ونحصل على المعلومة بشكل واضح… استفدت منه أكثر من المحاضرات الأونلاين» – أحد المستخدمين</w:t>
+            </w:r>
+          </w:p>
+          <w:p>
+            <w:pPr>
+              <w:bidi/>
+              <w:spacing w:after="0" w:before="0" w:line="260"/>
+              <w:jc w:val="both"/>
+            </w:pPr>
+            <w:r>
+              <w:rPr>
+                <w:rFonts w:ascii="Arial" w:cs="Arial" w:hAnsi="Arial"/>
+                <w:color w:val="5B6E7C"/>
+                <w:sz w:val="16"/>
+                <w:szCs w:val="16"/>
+                <w:rtl/>
+              </w:rPr>
+              <w:t xml:space="preserve">وُظِّفت الملاحظات (استئناف الفيديو، وسرعة التحميل، وقِصَر المقاطع، وطلب محتوى الأدوية) مدخلاتٍ للدورة التالية من التحسين.</w:t>
+            </w:r>
+          </w:p>
+        </w:tc>
+        <w:tc>
+          <w:tcPr>
+            <w:tcW w:type="dxa" w:w="4400"/>
+            <w:tcBorders>
+              <w:top w:val="single" w:color="7F9DB5" w:sz="6"/>
+              <w:left w:val="single" w:color="7F9DB5" w:sz="6"/>
+              <w:bottom w:val="single" w:color="7F9DB5" w:sz="6"/>
+              <w:right w:val="single" w:color="7F9DB5" w:sz="6"/>
+            </w:tcBorders>
+            <w:tcMar>
+              <w:top w:type="dxa" w:w="60"/>
+              <w:left w:type="dxa" w:w="100"/>
+              <w:bottom w:type="dxa" w:w="60"/>
+              <w:right w:type="dxa" w:w="100"/>
+            </w:tcMar>
+            <w:vAlign w:val="center"/>
+          </w:tcPr>
+          <w:p>
+            <w:pPr>
+              <w:spacing w:after="0"/>
+              <w:jc w:val="center"/>
+            </w:pPr>
+            <w:r>
+              <w:drawing>
+                <wp:inline distT="0" distB="0" distL="0" distR="0">
+                  <wp:extent cx="2714625" cy="1695450"/>
+                  <wp:effectExtent t="0" r="0" b="0" l="0"/>
+                  <wp:docPr id="1" name="" descr="" title=""/>
+                  <wp:cNvGraphicFramePr>
+                    <a:graphicFrameLocks xmlns:a="http://schemas.openxmlformats.org/drawingml/2006/main" noChangeAspect="1"/>
+                  </wp:cNvGraphicFramePr>
+                  <a:graphic xmlns:a="http://schemas.openxmlformats.org/drawingml/2006/main">
+                    <a:graphicData uri="http://schemas.openxmlformats.org/drawingml/2006/picture">
+                      <pic:pic xmlns:pic="http://schemas.openxmlformats.org/drawingml/2006/picture">
+                        <pic:nvPicPr>
+                          <pic:cNvPr id="0" name="" descr=""/>
+                          <pic:cNvPicPr>
+                            <a:picLocks noChangeAspect="1" noChangeArrowheads="1"/>
+                          </pic:cNvPicPr>
+                        </pic:nvPicPr>
+                        <pic:blipFill>
+                          <a:blip r:embed="rId21" cstate="none"/>
+                          <a:srcRect/>
+                          <a:stretch>
+                            <a:fillRect/>
+                          </a:stretch>
+                        </pic:blipFill>
+                        <pic:spPr bwMode="auto">
+                          <a:xfrm>
+                            <a:off x="0" y="0"/>
+                            <a:ext cx="2714625" cy="1695450"/>
+                          </a:xfrm>
+                          <a:prstGeom prst="rect">
+                            <a:avLst/>
+                          </a:prstGeom>
+                        </pic:spPr>
+                      </pic:pic>
+                    </a:graphicData>
+                  </a:graphic>
+                </wp:inline>
+              </w:drawing>
             </w:r>
           </w:p>
         </w:tc>
@@ -6530,7 +7062,7 @@
           <w:tbl>
             <w:tblPr>
               <w:bidiVisual/>
-              <w:tblW w:type="dxa" w:w="10306"/>
+              <w:tblW w:type="dxa" w:w="10086"/>
               <w:tblBorders>
                 <w:top w:val="single" w:color="auto" w:sz="4"/>
                 <w:left w:val="single" w:color="auto" w:sz="4"/>
@@ -6543,7 +7075,7 @@
             <w:tblGrid>
               <w:gridCol w:w="2100"/>
               <w:gridCol w:w="4300"/>
-              <w:gridCol w:w="3906"/>
+              <w:gridCol w:w="3686"/>
             </w:tblGrid>
             <w:tr>
               <w:trPr>
@@ -6627,7 +7159,7 @@
               </w:tc>
               <w:tc>
                 <w:tcPr>
-                  <w:tcW w:type="dxa" w:w="3906"/>
+                  <w:tcW w:type="dxa" w:w="3686"/>
                   <w:tcBorders>
                     <w:top w:val="single" w:color="7F9DB5" w:sz="6"/>
                     <w:left w:val="single" w:color="7F9DB5" w:sz="6"/>
@@ -6742,7 +7274,7 @@
               </w:tc>
               <w:tc>
                 <w:tcPr>
-                  <w:tcW w:type="dxa" w:w="3906"/>
+                  <w:tcW w:type="dxa" w:w="3686"/>
                   <w:tcBorders>
                     <w:top w:val="single" w:color="7F9DB5" w:sz="6"/>
                     <w:left w:val="single" w:color="7F9DB5" w:sz="6"/>
@@ -6855,7 +7387,7 @@
               </w:tc>
               <w:tc>
                 <w:tcPr>
-                  <w:tcW w:type="dxa" w:w="3906"/>
+                  <w:tcW w:type="dxa" w:w="3686"/>
                   <w:tcBorders>
                     <w:top w:val="single" w:color="7F9DB5" w:sz="6"/>
                     <w:left w:val="single" w:color="7F9DB5" w:sz="6"/>
@@ -6885,7 +7417,7 @@
                       <w:szCs w:val="17"/>
                       <w:rtl/>
                     </w:rPr>
-                    <w:t xml:space="preserve">من بث متكرر بمواعيد ثابتة ← 5 محاضرات مسجلة دائمة لـ10 مراكز</w:t>
+                    <w:t xml:space="preserve">خطة 2025: 106 جلسات لـ53 موضوعًا (نصفها تكرار) · للموضوعات الـ12: نحو 24 جلسة مباشرة سنويًا ← 5 محاضرات مسجلة (تقديري)</w:t>
                   </w:r>
                 </w:p>
               </w:tc>
@@ -6968,7 +7500,7 @@
               </w:tc>
               <w:tc>
                 <w:tcPr>
-                  <w:tcW w:type="dxa" w:w="3906"/>
+                  <w:tcW w:type="dxa" w:w="3686"/>
                   <w:tcBorders>
                     <w:top w:val="single" w:color="7F9DB5" w:sz="6"/>
                     <w:left w:val="single" w:color="7F9DB5" w:sz="6"/>
@@ -6998,7 +7530,7 @@
                       <w:szCs w:val="17"/>
                       <w:rtl/>
                     </w:rPr>
-                    <w:t xml:space="preserve">استخدام 81.8% (45/55) · وصول على مدار الساعة</w:t>
+                    <w:t xml:space="preserve">رضا 4.73 من 5 (94.7%) · استخدام 81.8% (45/55)</w:t>
                   </w:r>
                 </w:p>
               </w:tc>
@@ -7081,7 +7613,7 @@
               </w:tc>
               <w:tc>
                 <w:tcPr>
-                  <w:tcW w:type="dxa" w:w="3906"/>
+                  <w:tcW w:type="dxa" w:w="3686"/>
                   <w:tcBorders>
                     <w:top w:val="single" w:color="7F9DB5" w:sz="6"/>
                     <w:left w:val="single" w:color="7F9DB5" w:sz="6"/>

</xml_diff>

<commit_message>
Rewrite project text in a natural, human voice
Co-Authored-By: Claude Opus 5.5 <noreply@anthropic.com>
Claude-Session: https://claude.ai/code/session_01DAHviCoFUxWLSqCJvmpav8
</commit_message>
<xml_diff>
--- a/excellence_project/مشروع_التميز_التدريب_التمريضي_المطور.docx
+++ b/excellence_project/مشروع_التميز_التدريب_التمريضي_المطور.docx
@@ -1229,29 +1229,29 @@
                 <w:szCs w:val="18"/>
                 <w:rtl/>
               </w:rPr>
-              <w:t xml:space="preserve">خلال عامي 2024–2025 لم تتحقق مستهدفات الخطة التدريبية التمريضية بالكامل في </w:t>
-            </w:r>
-            <w:r>
-              <w:rPr>
-                <w:rFonts w:ascii="Arial" w:cs="Arial" w:hAnsi="Arial"/>
-                <w:b/>
-                <w:bCs/>
-                <w:color w:val="1D2B36"/>
-                <w:sz w:val="18"/>
-                <w:szCs w:val="18"/>
-                <w:rtl/>
-              </w:rPr>
-              <w:t xml:space="preserve">10 مراكز للرعاية الصحية الأولية</w:t>
-            </w:r>
-            <w:r>
-              <w:rPr>
-                <w:rFonts w:ascii="Arial" w:cs="Arial" w:hAnsi="Arial"/>
-                <w:color w:val="1D2B36"/>
-                <w:sz w:val="18"/>
-                <w:szCs w:val="18"/>
-                <w:rtl/>
-              </w:rPr>
-              <w:t xml:space="preserve">؛ إذ بلغ المتوسط المرجح لإنجاز المؤشرات الأكاديمية المعتمدة </w:t>
+              <w:t xml:space="preserve">على مدى عامين (2024 و2025) لم نتمكن من استكمال الخطة التدريبية التمريضية في </w:t>
+            </w:r>
+            <w:r>
+              <w:rPr>
+                <w:rFonts w:ascii="Arial" w:cs="Arial" w:hAnsi="Arial"/>
+                <w:b/>
+                <w:bCs/>
+                <w:color w:val="1D2B36"/>
+                <w:sz w:val="18"/>
+                <w:szCs w:val="18"/>
+                <w:rtl/>
+              </w:rPr>
+              <w:t xml:space="preserve">مراكزنا العشرة للرعاية الأولية</w:t>
+            </w:r>
+            <w:r>
+              <w:rPr>
+                <w:rFonts w:ascii="Arial" w:cs="Arial" w:hAnsi="Arial"/>
+                <w:color w:val="1D2B36"/>
+                <w:sz w:val="18"/>
+                <w:szCs w:val="18"/>
+                <w:rtl/>
+              </w:rPr>
+              <w:t xml:space="preserve">. فقد توقف متوسط الإنجاز المرجح للمؤشرات الأكاديمية عند </w:t>
             </w:r>
             <w:r>
               <w:rPr>
@@ -1273,7 +1273,7 @@
                 <w:szCs w:val="18"/>
                 <w:rtl/>
               </w:rPr>
-              <w:t xml:space="preserve"> مقابل مستهدف </w:t>
+              <w:t xml:space="preserve">، أي أننا كنا بعيدين عن المستهدف (</w:t>
             </w:r>
             <w:r>
               <w:rPr>
@@ -1295,7 +1295,7 @@
                 <w:szCs w:val="18"/>
                 <w:rtl/>
               </w:rPr>
-              <w:t xml:space="preserve"> (فجوة </w:t>
+              <w:t xml:space="preserve">) بـ</w:t>
             </w:r>
             <w:r>
               <w:rPr>
@@ -1317,7 +1317,7 @@
                 <w:szCs w:val="18"/>
                 <w:rtl/>
               </w:rPr>
-              <w:t xml:space="preserve">)، مع تدنٍّ حاد في بعض المجالات (تقييم التمريض 9.5% في 2024).</w:t>
+              <w:t xml:space="preserve">. وفي بعض المجالات كان الوضع أصعب؛ فتقييم التمريض مثلًا لم يتجاوز 9.5% في 2024.</w:t>
             </w:r>
           </w:p>
           <w:p>
@@ -1334,51 +1334,51 @@
                 <w:szCs w:val="18"/>
                 <w:rtl/>
               </w:rPr>
-              <w:t xml:space="preserve">ارتبطت الفجوة بآلية تقديم تعتمد على محاضرات Zoom متزامنة بمواعيد ثابتة لا تتوافق مع المناوبات وتغطية العيادات، ما استلزم </w:t>
-            </w:r>
-            <w:r>
-              <w:rPr>
-                <w:rFonts w:ascii="Arial" w:cs="Arial" w:hAnsi="Arial"/>
-                <w:b/>
-                <w:bCs/>
-                <w:color w:val="1D2B36"/>
-                <w:sz w:val="18"/>
-                <w:szCs w:val="18"/>
-                <w:rtl/>
-              </w:rPr>
-              <w:t xml:space="preserve">جدولة 106 جلسات مباشرة لـ53 موضوعًا في خطة 2025 (كُرِّر 92% منها مرتين أو أكثر)</w:t>
-            </w:r>
-            <w:r>
-              <w:rPr>
-                <w:rFonts w:ascii="Arial" w:cs="Arial" w:hAnsi="Arial"/>
-                <w:color w:val="1D2B36"/>
-                <w:sz w:val="18"/>
-                <w:szCs w:val="18"/>
-                <w:rtl/>
-              </w:rPr>
-              <w:t xml:space="preserve">، وترحيل 51 موضوعًا من خطة 2024 شكّلت 83% من مستهدف حضور 2025، مع جهد تنسيقي متكرر و</w:t>
-            </w:r>
-            <w:r>
-              <w:rPr>
-                <w:rFonts w:ascii="Arial" w:cs="Arial" w:hAnsi="Arial"/>
-                <w:b/>
-                <w:bCs/>
-                <w:color w:val="1D2B36"/>
-                <w:sz w:val="18"/>
-                <w:szCs w:val="18"/>
-                <w:rtl/>
-              </w:rPr>
-              <w:t xml:space="preserve">غياب آلية منهجية لقياس أثر التعلّم</w:t>
-            </w:r>
-            <w:r>
-              <w:rPr>
-                <w:rFonts w:ascii="Arial" w:cs="Arial" w:hAnsi="Arial"/>
-                <w:color w:val="1D2B36"/>
-                <w:sz w:val="18"/>
-                <w:szCs w:val="18"/>
-                <w:rtl/>
-              </w:rPr>
-              <w:t xml:space="preserve">؛ وهو ما ينعكس على جاهزية الكادر التمريضي وجودة الرعاية المقدمة للمستفيدين.</w:t>
+              <w:t xml:space="preserve">ولم تكن المشكلة في الموضوعات نفسها، بل في طريقة تقديمها. كنا نعتمد على محاضرات Zoom في مواعيد ثابتة، والممرض الذي لديه مناوبة أو يغطي عيادة لا يستطيع الحضور، فنضطر إلى إعادة المحاضرة. في خطة 2025 وحدها جدولنا </w:t>
+            </w:r>
+            <w:r>
+              <w:rPr>
+                <w:rFonts w:ascii="Arial" w:cs="Arial" w:hAnsi="Arial"/>
+                <w:b/>
+                <w:bCs/>
+                <w:color w:val="1D2B36"/>
+                <w:sz w:val="18"/>
+                <w:szCs w:val="18"/>
+                <w:rtl/>
+              </w:rPr>
+              <w:t xml:space="preserve">106 جلسات مباشرة لـ53 موضوعًا</w:t>
+            </w:r>
+            <w:r>
+              <w:rPr>
+                <w:rFonts w:ascii="Arial" w:cs="Arial" w:hAnsi="Arial"/>
+                <w:color w:val="1D2B36"/>
+                <w:sz w:val="18"/>
+                <w:szCs w:val="18"/>
+                <w:rtl/>
+              </w:rPr>
+              <w:t xml:space="preserve">، وكررنا 92% منها مرتين أو أكثر، إلى جانب 51 موضوعًا مرحّلًا من 2024 شكّلت 83% من مستهدف الحضور. وكل ذلك دون </w:t>
+            </w:r>
+            <w:r>
+              <w:rPr>
+                <w:rFonts w:ascii="Arial" w:cs="Arial" w:hAnsi="Arial"/>
+                <w:b/>
+                <w:bCs/>
+                <w:color w:val="1D2B36"/>
+                <w:sz w:val="18"/>
+                <w:szCs w:val="18"/>
+                <w:rtl/>
+              </w:rPr>
+              <w:t xml:space="preserve">طريقة منظمة نعرف بها هل تعلّم الكادر فعلًا</w:t>
+            </w:r>
+            <w:r>
+              <w:rPr>
+                <w:rFonts w:ascii="Arial" w:cs="Arial" w:hAnsi="Arial"/>
+                <w:color w:val="1D2B36"/>
+                <w:sz w:val="18"/>
+                <w:szCs w:val="18"/>
+                <w:rtl/>
+              </w:rPr>
+              <w:t xml:space="preserve">، وهذا ينعكس في النهاية على جاهزية الفريق وعلى الرعاية التي يتلقاها المراجعون.</w:t>
             </w:r>
           </w:p>
           <w:p>
@@ -1459,7 +1459,7 @@
                 <w:szCs w:val="18"/>
                 <w:rtl/>
               </w:rPr>
-              <w:t xml:space="preserve">رفع نسبة إنجاز المستهدفات الأكاديمية للتدريب التمريضي في 10 مراكز رعاية صحية أولية </w:t>
+              <w:t xml:space="preserve">نهدف إلى رفع نسبة إنجاز المستهدفات الأكاديمية للتدريب التمريضي في المراكز العشرة </w:t>
             </w:r>
             <w:r>
               <w:rPr>
@@ -1481,7 +1481,7 @@
                 <w:szCs w:val="18"/>
                 <w:rtl/>
               </w:rPr>
-              <w:t xml:space="preserve"> خلال الفترة </w:t>
+              <w:t xml:space="preserve"> خلال </w:t>
             </w:r>
             <w:r>
               <w:rPr>
@@ -1503,7 +1503,7 @@
                 <w:szCs w:val="18"/>
                 <w:rtl/>
               </w:rPr>
-              <w:t xml:space="preserve">، عبر منصة تعلّم مدمج موحدة تتيح 5 محاضرات مسجلة تغطي 12 موضوعًا للفئة المستهدفة (55 ممرضًا وممرضة)، مع تحقيق:</w:t>
+              <w:t xml:space="preserve">، من خلال منصة تعلّم مدمج تضم 5 محاضرات مسجلة تغطي 12 موضوعًا، وتخدم 55 ممرضًا وممرضة. ونعدّ المشروع ناجحًا إذا تحقق معه أيضًا:</w:t>
             </w:r>
           </w:p>
           <w:p>
@@ -1514,24 +1514,34 @@
             <w:r>
               <w:rPr>
                 <w:rFonts w:ascii="Arial" w:cs="Arial" w:hAnsi="Arial"/>
-                <w:b/>
-                <w:bCs/>
-                <w:color w:val="1D2B36"/>
-                <w:sz w:val="18"/>
-                <w:szCs w:val="18"/>
-                <w:rtl/>
-              </w:rPr>
-              <w:t xml:space="preserve">• نسبة استخدام للمنصة ≥ 80% </w:t>
-            </w:r>
-            <w:r>
-              <w:rPr>
-                <w:rFonts w:ascii="Arial" w:cs="Arial" w:hAnsi="Arial"/>
-                <w:color w:val="1D2B36"/>
-                <w:sz w:val="18"/>
-                <w:szCs w:val="18"/>
-                <w:rtl/>
-              </w:rPr>
-              <w:t xml:space="preserve">من المستهدفين.</w:t>
+                <w:color w:val="1D2B36"/>
+                <w:sz w:val="18"/>
+                <w:szCs w:val="18"/>
+                <w:rtl/>
+              </w:rPr>
+              <w:t xml:space="preserve">• أن يستخدم المنصة </w:t>
+            </w:r>
+            <w:r>
+              <w:rPr>
+                <w:rFonts w:ascii="Arial" w:cs="Arial" w:hAnsi="Arial"/>
+                <w:b/>
+                <w:bCs/>
+                <w:color w:val="1D2B36"/>
+                <w:sz w:val="18"/>
+                <w:szCs w:val="18"/>
+                <w:rtl/>
+              </w:rPr>
+              <w:t xml:space="preserve">80% على الأقل</w:t>
+            </w:r>
+            <w:r>
+              <w:rPr>
+                <w:rFonts w:ascii="Arial" w:cs="Arial" w:hAnsi="Arial"/>
+                <w:color w:val="1D2B36"/>
+                <w:sz w:val="18"/>
+                <w:szCs w:val="18"/>
+                <w:rtl/>
+              </w:rPr>
+              <w:t xml:space="preserve"> من المستهدفين.</w:t>
             </w:r>
           </w:p>
           <w:p>
@@ -1542,24 +1552,34 @@
             <w:r>
               <w:rPr>
                 <w:rFonts w:ascii="Arial" w:cs="Arial" w:hAnsi="Arial"/>
-                <w:b/>
-                <w:bCs/>
-                <w:color w:val="1D2B36"/>
-                <w:sz w:val="18"/>
-                <w:szCs w:val="18"/>
-                <w:rtl/>
-              </w:rPr>
-              <w:t xml:space="preserve">• تحسّن ≥ 10 نقاط مئوية </w:t>
-            </w:r>
-            <w:r>
-              <w:rPr>
-                <w:rFonts w:ascii="Arial" w:cs="Arial" w:hAnsi="Arial"/>
-                <w:color w:val="1D2B36"/>
-                <w:sz w:val="18"/>
-                <w:szCs w:val="18"/>
-                <w:rtl/>
-              </w:rPr>
-              <w:t xml:space="preserve">بين متوسطي الاختبار القبلي والبعدي.</w:t>
+                <w:color w:val="1D2B36"/>
+                <w:sz w:val="18"/>
+                <w:szCs w:val="18"/>
+                <w:rtl/>
+              </w:rPr>
+              <w:t xml:space="preserve">• أن يرتفع متوسط الاختبار البعدي عن القبلي بـ</w:t>
+            </w:r>
+            <w:r>
+              <w:rPr>
+                <w:rFonts w:ascii="Arial" w:cs="Arial" w:hAnsi="Arial"/>
+                <w:b/>
+                <w:bCs/>
+                <w:color w:val="1D2B36"/>
+                <w:sz w:val="18"/>
+                <w:szCs w:val="18"/>
+                <w:rtl/>
+              </w:rPr>
+              <w:t xml:space="preserve">10 نقاط مئوية على الأقل</w:t>
+            </w:r>
+            <w:r>
+              <w:rPr>
+                <w:rFonts w:ascii="Arial" w:cs="Arial" w:hAnsi="Arial"/>
+                <w:color w:val="1D2B36"/>
+                <w:sz w:val="18"/>
+                <w:szCs w:val="18"/>
+                <w:rtl/>
+              </w:rPr>
+              <w:t xml:space="preserve">.</w:t>
             </w:r>
           </w:p>
           <w:p>
@@ -1570,24 +1590,34 @@
             <w:r>
               <w:rPr>
                 <w:rFonts w:ascii="Arial" w:cs="Arial" w:hAnsi="Arial"/>
-                <w:b/>
-                <w:bCs/>
-                <w:color w:val="1D2B36"/>
-                <w:sz w:val="18"/>
-                <w:szCs w:val="18"/>
-                <w:rtl/>
-              </w:rPr>
-              <w:t xml:space="preserve">• متوسط ≥ 80% </w:t>
-            </w:r>
-            <w:r>
-              <w:rPr>
-                <w:rFonts w:ascii="Arial" w:cs="Arial" w:hAnsi="Arial"/>
-                <w:color w:val="1D2B36"/>
-                <w:sz w:val="18"/>
-                <w:szCs w:val="18"/>
-                <w:rtl/>
-              </w:rPr>
-              <w:t xml:space="preserve">في اختبار الاحتفاظ اللاحق بالمعلومات.</w:t>
+                <w:color w:val="1D2B36"/>
+                <w:sz w:val="18"/>
+                <w:szCs w:val="18"/>
+                <w:rtl/>
+              </w:rPr>
+              <w:t xml:space="preserve">• ألّا يقل متوسط اختبار الاحتفاظ اللاحق عن </w:t>
+            </w:r>
+            <w:r>
+              <w:rPr>
+                <w:rFonts w:ascii="Arial" w:cs="Arial" w:hAnsi="Arial"/>
+                <w:b/>
+                <w:bCs/>
+                <w:color w:val="1D2B36"/>
+                <w:sz w:val="18"/>
+                <w:szCs w:val="18"/>
+                <w:rtl/>
+              </w:rPr>
+              <w:t xml:space="preserve">80%</w:t>
+            </w:r>
+            <w:r>
+              <w:rPr>
+                <w:rFonts w:ascii="Arial" w:cs="Arial" w:hAnsi="Arial"/>
+                <w:color w:val="1D2B36"/>
+                <w:sz w:val="18"/>
+                <w:szCs w:val="18"/>
+                <w:rtl/>
+              </w:rPr>
+              <w:t xml:space="preserve">.</w:t>
             </w:r>
           </w:p>
           <w:p>
@@ -1603,7 +1633,7 @@
                 <w:szCs w:val="18"/>
                 <w:rtl/>
               </w:rPr>
-              <w:t xml:space="preserve">مع تعزيز التطبيق العملي عبر ورش داخل المراكز الصحية.</w:t>
+              <w:t xml:space="preserve">ويرافق ذلك ورش تطبيقية داخل المراكز تربط ما تعلّمه الكادر بعمله اليومي.</w:t>
             </w:r>
           </w:p>
           <w:p>
@@ -1946,7 +1976,7 @@
                 <w:szCs w:val="18"/>
                 <w:rtl/>
               </w:rPr>
-              <w:t xml:space="preserve">مراجعة المؤشرات الأكاديمية المعتمدة لعامي 2024 و2025 لخمسة مجالات تدريبية في 10 مراكز، ومقارنة المتحقق بالمستهدف. بلغ المتوسط المرجح للإنجاز </w:t>
+              <w:t xml:space="preserve">بدأنا بمراجعة المؤشرات الأكاديمية المعتمدة لعامي 2024 و2025 في خمسة مجالات تدريبية، وقارنّا ما تحقق بما كان مستهدفًا. كان المتوسط المرجح </w:t>
             </w:r>
             <w:r>
               <w:rPr>
@@ -1968,29 +1998,29 @@
                 <w:szCs w:val="18"/>
                 <w:rtl/>
               </w:rPr>
-              <w:t xml:space="preserve">، وتراوح إنجاز 2024 بين 9.5% و72.7%. وعلى مستوى التجمع جاء قطاع البكيرية في المرتبة 11 من 15 قطاعًا في 2024 بنسبة حضور 83.8% مقابل 99.9% لأعلى قطاع. ورغم التحسن الجزئي في 2025 بتكثيف محاضرات Zoom وإعادة بعضها، استمر الاعتماد على مواعيد ثابتة. حُدِّد نطاق التحسين بعملية </w:t>
-            </w:r>
-            <w:r>
-              <w:rPr>
-                <w:rFonts w:ascii="Arial" w:cs="Arial" w:hAnsi="Arial"/>
-                <w:b/>
-                <w:bCs/>
-                <w:color w:val="1D2B36"/>
-                <w:sz w:val="18"/>
-                <w:szCs w:val="18"/>
-                <w:rtl/>
-              </w:rPr>
-              <w:t xml:space="preserve">«تقديم التدريب النظري وقياس أثره»</w:t>
-            </w:r>
-            <w:r>
-              <w:rPr>
-                <w:rFonts w:ascii="Arial" w:cs="Arial" w:hAnsi="Arial"/>
-                <w:color w:val="1D2B36"/>
-                <w:sz w:val="18"/>
-                <w:szCs w:val="18"/>
-                <w:rtl/>
-              </w:rPr>
-              <w:t xml:space="preserve"> دون تغيير الموضوعات الأكاديمية المعتمدة.</w:t>
+              <w:t xml:space="preserve">، وتراوح إنجاز 2024 بين 9.5% و72.7%. وحين قارنّا أنفسنا ببقية قطاعات التجمع في 2024 وجدنا البكيرية في المرتبة 11 من 15 بنسبة حضور 83.8%، بينما وصل أعلى قطاع إلى 99.9%. صحيح أن 2025 شهدت تحسنًا بعد تكثيف محاضرات Zoom وإعادة بعضها، لكن أصل المشكلة بقي كما هو: المواعيد الثابتة. لذلك حصرنا التحسين في </w:t>
+            </w:r>
+            <w:r>
+              <w:rPr>
+                <w:rFonts w:ascii="Arial" w:cs="Arial" w:hAnsi="Arial"/>
+                <w:b/>
+                <w:bCs/>
+                <w:color w:val="1D2B36"/>
+                <w:sz w:val="18"/>
+                <w:szCs w:val="18"/>
+                <w:rtl/>
+              </w:rPr>
+              <w:t xml:space="preserve">طريقة تقديم التدريب النظري وقياس أثره</w:t>
+            </w:r>
+            <w:r>
+              <w:rPr>
+                <w:rFonts w:ascii="Arial" w:cs="Arial" w:hAnsi="Arial"/>
+                <w:color w:val="1D2B36"/>
+                <w:sz w:val="18"/>
+                <w:szCs w:val="18"/>
+                <w:rtl/>
+              </w:rPr>
+              <w:t xml:space="preserve">، وأبقينا الموضوعات الأكاديمية المعتمدة كما هي.</w:t>
             </w:r>
           </w:p>
           <w:p>
@@ -2166,7 +2196,7 @@
                 <w:szCs w:val="18"/>
                 <w:rtl/>
               </w:rPr>
-              <w:t xml:space="preserve">مبادرة بقيادة </w:t>
+              <w:t xml:space="preserve">قادت المشروع </w:t>
             </w:r>
             <w:r>
               <w:rPr>
@@ -2188,7 +2218,7 @@
                 <w:szCs w:val="18"/>
                 <w:rtl/>
               </w:rPr>
-              <w:t xml:space="preserve"> (المساءلة والتنفيذ: تحليل البيانات، تصميم التدخل، إعداد المحتوى والاختبارات، التنسيق مع المراكز، قياس النتائج)، بدعم </w:t>
+              <w:t xml:space="preserve">، وتولّت بنفسها تحليل البيانات وتصميم الحل وإعداد المحتوى والاختبارات والتنسيق مع المراكز وقياس النتائج. وساعدنا </w:t>
             </w:r>
             <w:r>
               <w:rPr>
@@ -2210,7 +2240,7 @@
                 <w:szCs w:val="18"/>
                 <w:rtl/>
               </w:rPr>
-              <w:t xml:space="preserve"> لبرمجة المنصة وفق المتطلبات المحددة، وبالتنسيق مع </w:t>
+              <w:t xml:space="preserve"> في برمجة المنصة وفق المتطلبات التي حددناها، فيما سهّلت </w:t>
             </w:r>
             <w:r>
               <w:rPr>
@@ -2232,7 +2262,7 @@
                 <w:szCs w:val="18"/>
                 <w:rtl/>
               </w:rPr>
-              <w:t xml:space="preserve"> لتسهيل التطبيق والورش. وُثِّقت الأدوار في مصفوفة RACI لضمان وضوح المساءلة ومنع ازدواج المهام.</w:t>
+              <w:t xml:space="preserve"> التطبيق والورش. ووضعنا الأدوار في مصفوفة RACI حتى يعرف كل طرف ما المطلوب منه بالضبط، ولا تتداخل المهام.</w:t>
             </w:r>
           </w:p>
           <w:p>
@@ -2408,41 +2438,41 @@
                 <w:szCs w:val="18"/>
                 <w:rtl/>
               </w:rPr>
-              <w:t xml:space="preserve">رُسمت العملية الحالية (As-Is) في 5 خطوات وحُدِّدت </w:t>
-            </w:r>
-            <w:r>
-              <w:rPr>
-                <w:rFonts w:ascii="Arial" w:cs="Arial" w:hAnsi="Arial"/>
-                <w:b/>
-                <w:bCs/>
-                <w:color w:val="1D2B36"/>
-                <w:sz w:val="18"/>
-                <w:szCs w:val="18"/>
-                <w:rtl/>
-              </w:rPr>
-              <w:t xml:space="preserve">4 نقاط اختناق/هدر</w:t>
-            </w:r>
-            <w:r>
-              <w:rPr>
-                <w:rFonts w:ascii="Arial" w:cs="Arial" w:hAnsi="Arial"/>
-                <w:color w:val="1D2B36"/>
-                <w:sz w:val="18"/>
-                <w:szCs w:val="18"/>
-                <w:rtl/>
-              </w:rPr>
-              <w:t xml:space="preserve">: الموعد الثابت للبث، والتنسيق المتكرر مع 10 مراكز، وتعارض الحضور مع المناوبات، وإعادة المحاضرة لمن تغيّب، مع غياب نقطة لقياس أثر التعلّم. ثم صُمِّمت العملية المستهدفة (To-Be) مسارَ تعلّمٍ مدمج عند الطلب: </w:t>
-            </w:r>
-            <w:r>
-              <w:rPr>
-                <w:rFonts w:ascii="Arial" w:cs="Arial" w:hAnsi="Arial"/>
-                <w:b/>
-                <w:bCs/>
-                <w:color w:val="1D2B36"/>
-                <w:sz w:val="18"/>
-                <w:szCs w:val="18"/>
-                <w:rtl/>
-              </w:rPr>
-              <w:t xml:space="preserve">دخول المنصة ← اختبار قبلي ← محتوى مسجّل ← اختبار بعدي ← اختبار احتفاظ وورشة تطبيقية.</w:t>
+              <w:t xml:space="preserve">رسمنا خطوات التدريب كما كانت تجري فعلًا، فظهرت خمس خطوات بينها </w:t>
+            </w:r>
+            <w:r>
+              <w:rPr>
+                <w:rFonts w:ascii="Arial" w:cs="Arial" w:hAnsi="Arial"/>
+                <w:b/>
+                <w:bCs/>
+                <w:color w:val="1D2B36"/>
+                <w:sz w:val="18"/>
+                <w:szCs w:val="18"/>
+                <w:rtl/>
+              </w:rPr>
+              <w:t xml:space="preserve">أربع نقاط هدر</w:t>
+            </w:r>
+            <w:r>
+              <w:rPr>
+                <w:rFonts w:ascii="Arial" w:cs="Arial" w:hAnsi="Arial"/>
+                <w:color w:val="1D2B36"/>
+                <w:sz w:val="18"/>
+                <w:szCs w:val="18"/>
+                <w:rtl/>
+              </w:rPr>
+              <w:t xml:space="preserve">: موعد بث ثابت، وتنسيق متكرر مع عشرة مراكز، وتعارض الحضور مع المناوبات، ثم إعادة المحاضرة لمن فاتته. ولم تكن في المسار أي خطوة تقيس ما تعلّمه الممرض. بعدها صممنا المسار الجديد بحيث يتعلّم كل ممرض في الوقت الذي يناسبه: </w:t>
+            </w:r>
+            <w:r>
+              <w:rPr>
+                <w:rFonts w:ascii="Arial" w:cs="Arial" w:hAnsi="Arial"/>
+                <w:b/>
+                <w:bCs/>
+                <w:color w:val="1D2B36"/>
+                <w:sz w:val="18"/>
+                <w:szCs w:val="18"/>
+                <w:rtl/>
+              </w:rPr>
+              <w:t xml:space="preserve">يدخل المنصة، ويؤدي اختبارًا قبليًا، ويشاهد المحتوى المسجّل، ثم يؤدي اختبارًا بعديًا، ولاحقًا اختبار احتفاظ وورشة تطبيقية.</w:t>
             </w:r>
           </w:p>
           <w:p>
@@ -2619,7 +2649,7 @@
                 <w:szCs w:val="18"/>
                 <w:rtl/>
               </w:rPr>
-              <w:t xml:space="preserve">صُنِّفت الأسباب المحتملة في </w:t>
+              <w:t xml:space="preserve">جمعنا الأسباب المحتملة في مخطط عظمة السمكة ضمن </w:t>
             </w:r>
             <w:r>
               <w:rPr>
@@ -2641,39 +2671,39 @@
                 <w:szCs w:val="18"/>
                 <w:rtl/>
               </w:rPr>
-              <w:t xml:space="preserve"> (طريقة التقديم، الكوادر والمناوبات، التوزيع الجغرافي، الوصول إلى المحتوى، قياس الأثر، التنسيق والمتابعة)، ثم طُبِّق «لماذا الخمس»: </w:t>
-            </w:r>
-            <w:r>
-              <w:rPr>
-                <w:rFonts w:ascii="Arial" w:cs="Arial" w:hAnsi="Arial"/>
-                <w:color w:val="1D2B36"/>
-                <w:sz w:val="18"/>
-                <w:szCs w:val="18"/>
-                <w:rtl/>
-              </w:rPr>
-              <w:t xml:space="preserve">لماذا لم تتحقق المستهدفات؟ لصعوبة حضور الكادر ← لأن الحضور مرتبط بموعد بث ثابت ← لأن التدريب متزامن فقط ← لعدم وجود محتوى مسجّل ومنصة موحدة ← لغياب مسار رقمي متكامل للتعلّم والقياس. </w:t>
-            </w:r>
-            <w:r>
-              <w:rPr>
-                <w:rFonts w:ascii="Arial" w:cs="Arial" w:hAnsi="Arial"/>
-                <w:b/>
-                <w:bCs/>
-                <w:color w:val="1D2B36"/>
-                <w:sz w:val="18"/>
-                <w:szCs w:val="18"/>
-                <w:rtl/>
-              </w:rPr>
-              <w:t xml:space="preserve">السببان الجذريان: </w:t>
-            </w:r>
-            <w:r>
-              <w:rPr>
-                <w:rFonts w:ascii="Arial" w:cs="Arial" w:hAnsi="Arial"/>
-                <w:color w:val="1D2B36"/>
-                <w:sz w:val="18"/>
-                <w:szCs w:val="18"/>
-                <w:rtl/>
-              </w:rPr>
-              <w:t xml:space="preserve">(1) ارتباط التدريب النظري بموعد متزامن واحد لا يتوافق مع المناوبات، (2) غياب مسار منهجي لقياس التعلّم يوجّه المتابعة. وأكدت بيانات 2025 عبء الترحيل؛ إذ شكّلت موضوعات 2024 المُرحّلة 83% من مستهدف الحضور. واستُبعد «غياب المؤشرات» لأنها معتمدة ومتاحة.</w:t>
+              <w:t xml:space="preserve">: طريقة التقديم، والكوادر والمناوبات، والتوزيع الجغرافي، والوصول إلى المحتوى، وقياس الأثر، والتنسيق والمتابعة. ثم سألنا «لماذا؟» خمس مرات: </w:t>
+            </w:r>
+            <w:r>
+              <w:rPr>
+                <w:rFonts w:ascii="Arial" w:cs="Arial" w:hAnsi="Arial"/>
+                <w:color w:val="1D2B36"/>
+                <w:sz w:val="18"/>
+                <w:szCs w:val="18"/>
+                <w:rtl/>
+              </w:rPr>
+              <w:t xml:space="preserve">لماذا لم تتحقق المستهدفات؟ لأن الكادر يجد صعوبة في الحضور. ولماذا؟ لأن الحضور مرتبط بموعد بث ثابت. ولماذا؟ لأن التدريب كله متزامن. ولماذا؟ لأنه لا يوجد محتوى مسجّل ولا منصة موحدة. ولماذا؟ لأننا لم نبنِ بعدُ مسارًا رقميًا للتعلّم والقياس. </w:t>
+            </w:r>
+            <w:r>
+              <w:rPr>
+                <w:rFonts w:ascii="Arial" w:cs="Arial" w:hAnsi="Arial"/>
+                <w:b/>
+                <w:bCs/>
+                <w:color w:val="1D2B36"/>
+                <w:sz w:val="18"/>
+                <w:szCs w:val="18"/>
+                <w:rtl/>
+              </w:rPr>
+              <w:t xml:space="preserve">وانتهينا إلى سببين جذريين: </w:t>
+            </w:r>
+            <w:r>
+              <w:rPr>
+                <w:rFonts w:ascii="Arial" w:cs="Arial" w:hAnsi="Arial"/>
+                <w:color w:val="1D2B36"/>
+                <w:sz w:val="18"/>
+                <w:szCs w:val="18"/>
+                <w:rtl/>
+              </w:rPr>
+              <w:t xml:space="preserve">الأول أن التدريب النظري مربوط بموعد واحد لا يناسب المناوبات، والثاني أنه لا توجد طريقة منظمة لقياس التعلّم. وبيانات 2025 أكدت حجم العبء؛ فالموضوعات المرحّلة من 2024 وحدها شكّلت 83% من مستهدف الحضور. أما المؤشرات الأكاديمية فلم نعدّها سببًا، لأنها معتمدة ومتاحة أصلًا.</w:t>
             </w:r>
           </w:p>
           <w:p>
@@ -2855,29 +2885,29 @@
                 <w:szCs w:val="18"/>
                 <w:rtl/>
               </w:rPr>
-              <w:t xml:space="preserve">قورنت </w:t>
-            </w:r>
-            <w:r>
-              <w:rPr>
-                <w:rFonts w:ascii="Arial" w:cs="Arial" w:hAnsi="Arial"/>
-                <w:b/>
-                <w:bCs/>
-                <w:color w:val="1D2B36"/>
-                <w:sz w:val="18"/>
-                <w:szCs w:val="18"/>
-                <w:rtl/>
-              </w:rPr>
-              <w:t xml:space="preserve">3 بدائل</w:t>
-            </w:r>
-            <w:r>
-              <w:rPr>
-                <w:rFonts w:ascii="Arial" w:cs="Arial" w:hAnsi="Arial"/>
-                <w:color w:val="1D2B36"/>
-                <w:sz w:val="18"/>
-                <w:szCs w:val="18"/>
-                <w:rtl/>
-              </w:rPr>
-              <w:t xml:space="preserve"> وفق </w:t>
+              <w:t xml:space="preserve">كان أمامنا </w:t>
+            </w:r>
+            <w:r>
+              <w:rPr>
+                <w:rFonts w:ascii="Arial" w:cs="Arial" w:hAnsi="Arial"/>
+                <w:b/>
+                <w:bCs/>
+                <w:color w:val="1D2B36"/>
+                <w:sz w:val="18"/>
+                <w:szCs w:val="18"/>
+                <w:rtl/>
+              </w:rPr>
+              <w:t xml:space="preserve">3 خيارات</w:t>
+            </w:r>
+            <w:r>
+              <w:rPr>
+                <w:rFonts w:ascii="Arial" w:cs="Arial" w:hAnsi="Arial"/>
+                <w:color w:val="1D2B36"/>
+                <w:sz w:val="18"/>
+                <w:szCs w:val="18"/>
+                <w:rtl/>
+              </w:rPr>
+              <w:t xml:space="preserve">: أن نستمر في المحاضرات المباشرة ونكررها، أو نتحول إلى التعلّم الإلكتروني وحده، أو نجمع بينهما في تعلّم مدمج. قارنّا بينها وفق </w:t>
             </w:r>
             <w:r>
               <w:rPr>
@@ -2899,7 +2929,7 @@
                 <w:szCs w:val="18"/>
                 <w:rtl/>
               </w:rPr>
-              <w:t xml:space="preserve"> (مرونة التوقيت، ملاءمة المراكز الطرفية، قياس التحسن المعرفي، التطبيق العملي، الجهد التنظيمي، شمولية معالجة الأسباب). اختير </w:t>
+              <w:t xml:space="preserve">: مرونة التوقيت، وملاءمة المراكز الطرفية، وقياس التحسن المعرفي، والتطبيق العملي، والجهد التنظيمي، ومدى معالجة الأسباب. ووقع اختيارنا على </w:t>
             </w:r>
             <w:r>
               <w:rPr>
@@ -2921,7 +2951,7 @@
                 <w:szCs w:val="18"/>
                 <w:rtl/>
               </w:rPr>
-              <w:t xml:space="preserve">: منصة موحدة بمحتوى مسجّل واختبارات قبلية/بعدية/لاحقة + ورش تطبيقية قصيرة داخل المراكز؛ لأنه البديل الوحيد الذي يعالج السببين الجذريين معًا. ويتّسق الاختيار مع الأدلة العلمية؛ إذ أظهرت مراجعة منهجية وتحليل تلوي (Liu et al., 2016) أن التعلّم المدمج في المهن الصحية يحقق نتائج معرفية أفضل من التعليم التقليدي أو مماثلة له.</w:t>
+              <w:t xml:space="preserve">: منصة موحدة فيها محتوى مسجّل واختبارات قبلية وبعدية ولاحقة، مع ورش تطبيقية قصيرة داخل المراكز؛ لأنه الخيار الوحيد الذي يعالج السببين معًا. ويدعم هذا الاختيار ما توصلت إليه مراجعة منهجية وتحليل تلوي (Liu et al., 2016) من أن التعلّم المدمج في المهن الصحية يحقق نتائج معرفية أفضل من التعليم التقليدي، أو مماثلة له على الأقل.</w:t>
             </w:r>
           </w:p>
           <w:p>
@@ -3307,19 +3337,19 @@
                 <w:szCs w:val="18"/>
                 <w:rtl/>
               </w:rPr>
-              <w:t xml:space="preserve">خطة تنفيذية تحدد لكل نشاط: ماذا، ومن، ومتى، ومؤشر النجاح، على 5 مراحل: تحليل الفجوات واعتماد خط الأساس ومقاييس النجاح في مارس، ثم إعداد المحتوى والاختبارات وبرمجة المنصة مع المطوّر التقني بدءًا من 17 أبريل، ثم التجربة على نطاق صغير بالمراكز الطرفية في مايو، ثم التعميم وتنفيذ الورش في يونيو، ثم المتابعة والقياس حتى أكتوبر. </w:t>
-            </w:r>
-            <w:r>
-              <w:rPr>
-                <w:rFonts w:ascii="Arial" w:cs="Arial" w:hAnsi="Arial"/>
-                <w:b/>
-                <w:bCs/>
-                <w:color w:val="1D2B36"/>
-                <w:sz w:val="18"/>
-                <w:szCs w:val="18"/>
-                <w:rtl/>
-              </w:rPr>
-              <w:t xml:space="preserve">حُدِّدت 4 مؤشرات نجاح مرتبطة مباشرة بالهدف الذكي.</w:t>
+              <w:t xml:space="preserve">قسّمنا العمل إلى خمس مراحل، وحددنا لكل نشاط ما المطلوب، ومن ينفذه، ومتى، وكيف نعرف أنه نجح. في مارس حللنا الفجوات واعتمدنا خط الأساس ومقاييس النجاح، ومن 17 أبريل بدأنا إعداد المحتوى والاختبارات وبرمجة المنصة مع المطوّر التقني. وفي مايو جرّبنا المنصة على نطاق صغير في المراكز الطرفية، ثم عممناها ونفذنا الورش في يونيو، وواصلنا المتابعة والقياس حتى أكتوبر. </w:t>
+            </w:r>
+            <w:r>
+              <w:rPr>
+                <w:rFonts w:ascii="Arial" w:cs="Arial" w:hAnsi="Arial"/>
+                <w:b/>
+                <w:bCs/>
+                <w:color w:val="1D2B36"/>
+                <w:sz w:val="18"/>
+                <w:szCs w:val="18"/>
+                <w:rtl/>
+              </w:rPr>
+              <w:t xml:space="preserve">وربطنا الخطة بأربعة مؤشرات نجاح مأخوذة مباشرة من الهدف الذكي.</w:t>
             </w:r>
           </w:p>
           <w:p>
@@ -3495,51 +3525,51 @@
                 <w:szCs w:val="18"/>
                 <w:rtl/>
               </w:rPr>
-              <w:t xml:space="preserve">بدأ </w:t>
-            </w:r>
-            <w:r>
-              <w:rPr>
-                <w:rFonts w:ascii="Arial" w:cs="Arial" w:hAnsi="Arial"/>
-                <w:b/>
-                <w:bCs/>
-                <w:color w:val="1D2B36"/>
-                <w:sz w:val="18"/>
-                <w:szCs w:val="18"/>
-                <w:rtl/>
-              </w:rPr>
-              <w:t xml:space="preserve">التطبيق التجريبي في مايو 2026 بالمراكز الطرفية</w:t>
-            </w:r>
-            <w:r>
-              <w:rPr>
-                <w:rFonts w:ascii="Arial" w:cs="Arial" w:hAnsi="Arial"/>
-                <w:color w:val="1D2B36"/>
-                <w:sz w:val="18"/>
-                <w:szCs w:val="18"/>
-                <w:rtl/>
-              </w:rPr>
-              <w:t xml:space="preserve"> (الأكثر تأثرًا بالبعد الجغرافي) للتحقق من سهولة الدخول ووضوح المحتوى وعمل الاختبارات، ثم </w:t>
-            </w:r>
-            <w:r>
-              <w:rPr>
-                <w:rFonts w:ascii="Arial" w:cs="Arial" w:hAnsi="Arial"/>
-                <w:b/>
-                <w:bCs/>
-                <w:color w:val="1D2B36"/>
-                <w:sz w:val="18"/>
-                <w:szCs w:val="18"/>
-                <w:rtl/>
-              </w:rPr>
-              <w:t xml:space="preserve">عُمِّم في يونيو على المراكز العشرة</w:t>
-            </w:r>
-            <w:r>
-              <w:rPr>
-                <w:rFonts w:ascii="Arial" w:cs="Arial" w:hAnsi="Arial"/>
-                <w:color w:val="1D2B36"/>
-                <w:sz w:val="18"/>
-                <w:szCs w:val="18"/>
-                <w:rtl/>
-              </w:rPr>
-              <w:t xml:space="preserve">. أُتيحت 5 محاضرات مسجلة تغطي 12 موضوعًا مع اختبارات إلكترونية قبلية وبعدية لكل موضوع، ونُفِّذت 10 ورش تطبيقية داخل المراكز، مع متابعة الدخول وإتمام التقييمات دون الحاجة إلى مواعيد بث مباشر متكررة.</w:t>
+              <w:t xml:space="preserve">بدأنا </w:t>
+            </w:r>
+            <w:r>
+              <w:rPr>
+                <w:rFonts w:ascii="Arial" w:cs="Arial" w:hAnsi="Arial"/>
+                <w:b/>
+                <w:bCs/>
+                <w:color w:val="1D2B36"/>
+                <w:sz w:val="18"/>
+                <w:szCs w:val="18"/>
+                <w:rtl/>
+              </w:rPr>
+              <w:t xml:space="preserve">التجربة في مايو 2026 بالمراكز الطرفية</w:t>
+            </w:r>
+            <w:r>
+              <w:rPr>
+                <w:rFonts w:ascii="Arial" w:cs="Arial" w:hAnsi="Arial"/>
+                <w:color w:val="1D2B36"/>
+                <w:sz w:val="18"/>
+                <w:szCs w:val="18"/>
+                <w:rtl/>
+              </w:rPr>
+              <w:t xml:space="preserve">، لأنها الأكثر تأثرًا ببعد المسافة، وأردنا أن نتأكد من سهولة الدخول ووضوح المحتوى وسلامة الاختبارات قبل التوسع. وفي يونيو </w:t>
+            </w:r>
+            <w:r>
+              <w:rPr>
+                <w:rFonts w:ascii="Arial" w:cs="Arial" w:hAnsi="Arial"/>
+                <w:b/>
+                <w:bCs/>
+                <w:color w:val="1D2B36"/>
+                <w:sz w:val="18"/>
+                <w:szCs w:val="18"/>
+                <w:rtl/>
+              </w:rPr>
+              <w:t xml:space="preserve">عممنا المنصة على المراكز العشرة</w:t>
+            </w:r>
+            <w:r>
+              <w:rPr>
+                <w:rFonts w:ascii="Arial" w:cs="Arial" w:hAnsi="Arial"/>
+                <w:color w:val="1D2B36"/>
+                <w:sz w:val="18"/>
+                <w:szCs w:val="18"/>
+                <w:rtl/>
+              </w:rPr>
+              <w:t xml:space="preserve">. أتحنا 5 محاضرات مسجلة تغطي 12 موضوعًا، لكل موضوع اختبار إلكتروني قبلي وبعدي، ونفذنا 10 ورش تطبيقية داخل المراكز. وتابعنا الدخول وإتمام التقييمات أولًا بأول، دون الحاجة إلى مواعيد بث مباشر متكررة.</w:t>
             </w:r>
           </w:p>
           <w:p>
@@ -3715,7 +3745,7 @@
                 <w:szCs w:val="18"/>
                 <w:rtl/>
               </w:rPr>
-              <w:t xml:space="preserve">قيس الأثر على مستوى «التعلّم» (المستوى الثاني في نموذج Kirkpatrick) عبر </w:t>
+              <w:t xml:space="preserve">قسنا الأثر على مستوى «التعلّم»، وهو المستوى الثاني في نموذج Kirkpatrick، من خلال </w:t>
             </w:r>
             <w:r>
               <w:rPr>
@@ -3737,7 +3767,7 @@
                 <w:szCs w:val="18"/>
                 <w:rtl/>
               </w:rPr>
-              <w:t xml:space="preserve">: ارتفع المتوسط المرجح من </w:t>
+              <w:t xml:space="preserve">. ارتفع المتوسط المرجح من </w:t>
             </w:r>
             <w:r>
               <w:rPr>
@@ -3759,7 +3789,7 @@
                 <w:szCs w:val="18"/>
                 <w:rtl/>
               </w:rPr>
-              <w:t xml:space="preserve"> (+12.21 نقطة مئوية؛ تحسّن نسبي 15.6%)، وبلغ متوسط الاختبار الورقي اللاحق للاحتفاظ بالمعلومات </w:t>
+              <w:t xml:space="preserve">، أي بزيادة 12.21 نقطة مئوية (تحسّن نسبي 15.6%). ثم أجرينا لاحقًا اختبارًا ورقيًا لنعرف ما بقي من المعلومات، فكان المتوسط </w:t>
             </w:r>
             <w:r>
               <w:rPr>
@@ -3781,19 +3811,19 @@
                 <w:szCs w:val="18"/>
                 <w:rtl/>
               </w:rPr>
-              <w:t xml:space="preserve"> (37 نتيجة). واستخدم المنصة </w:t>
-            </w:r>
-            <w:r>
-              <w:rPr>
-                <w:rFonts w:ascii="Arial" w:cs="Arial" w:hAnsi="Arial"/>
-                <w:b/>
-                <w:bCs/>
-                <w:color w:val="1D2B36"/>
-                <w:sz w:val="18"/>
-                <w:szCs w:val="18"/>
-                <w:rtl/>
-              </w:rPr>
-              <w:t xml:space="preserve">45 من 55 مستهدفًا (81.8%)</w:t>
+              <w:t xml:space="preserve"> في 37 نتيجة. واستخدم المنصة </w:t>
+            </w:r>
+            <w:r>
+              <w:rPr>
+                <w:rFonts w:ascii="Arial" w:cs="Arial" w:hAnsi="Arial"/>
+                <w:b/>
+                <w:bCs/>
+                <w:color w:val="1D2B36"/>
+                <w:sz w:val="18"/>
+                <w:szCs w:val="18"/>
+                <w:rtl/>
+              </w:rPr>
+              <w:t xml:space="preserve">45 من أصل 55 مستهدفًا (81.8%)</w:t>
             </w:r>
             <w:r>
               <w:rPr>
@@ -3825,29 +3855,29 @@
                 <w:szCs w:val="18"/>
                 <w:rtl/>
               </w:rPr>
-              <w:t xml:space="preserve"> مقابل خط أساس 69.60%. وقيس رضا المستخدمين باستبيان إلكتروني: </w:t>
-            </w:r>
-            <w:r>
-              <w:rPr>
-                <w:rFonts w:ascii="Arial" w:cs="Arial" w:hAnsi="Arial"/>
-                <w:b/>
-                <w:bCs/>
-                <w:color w:val="1D2B36"/>
-                <w:sz w:val="18"/>
-                <w:szCs w:val="18"/>
-                <w:rtl/>
-              </w:rPr>
-              <w:t xml:space="preserve">متوسط 4.73 من 5 (94.7%)</w:t>
-            </w:r>
-            <w:r>
-              <w:rPr>
-                <w:rFonts w:ascii="Arial" w:cs="Arial" w:hAnsi="Arial"/>
-                <w:color w:val="1D2B36"/>
-                <w:sz w:val="18"/>
-                <w:szCs w:val="18"/>
-                <w:rtl/>
-              </w:rPr>
-              <w:t xml:space="preserve">، وجميع الإجابات «موافق» أو «موافق بشدة» (6 ردود).</w:t>
+              <w:t xml:space="preserve"> بعد أن كانت 69.60%. وسألنا المستخدمين عن رأيهم في استبيان إلكتروني، فجاء المتوسط </w:t>
+            </w:r>
+            <w:r>
+              <w:rPr>
+                <w:rFonts w:ascii="Arial" w:cs="Arial" w:hAnsi="Arial"/>
+                <w:b/>
+                <w:bCs/>
+                <w:color w:val="1D2B36"/>
+                <w:sz w:val="18"/>
+                <w:szCs w:val="18"/>
+                <w:rtl/>
+              </w:rPr>
+              <w:t xml:space="preserve">4.73 من 5 (94.7%)</w:t>
+            </w:r>
+            <w:r>
+              <w:rPr>
+                <w:rFonts w:ascii="Arial" w:cs="Arial" w:hAnsi="Arial"/>
+                <w:color w:val="1D2B36"/>
+                <w:sz w:val="18"/>
+                <w:szCs w:val="18"/>
+                <w:rtl/>
+              </w:rPr>
+              <w:t xml:space="preserve">، ولم يُبدِ أيٌّ من المجيبين الستة عدم موافقة.</w:t>
             </w:r>
           </w:p>
           <w:p>
@@ -4023,7 +4053,7 @@
                 <w:szCs w:val="18"/>
                 <w:rtl/>
               </w:rPr>
-              <w:t xml:space="preserve">يُحافَظ على التعلّم المدمج قناةً ثابتة للتدريب النظري في المراكز العشرة وفق </w:t>
+              <w:t xml:space="preserve">سنستمر في التعلّم المدمج قناةً ثابتة للتدريب النظري في المراكز العشرة، ووضعنا </w:t>
             </w:r>
             <w:r>
               <w:rPr>
@@ -4045,51 +4075,51 @@
                 <w:szCs w:val="18"/>
                 <w:rtl/>
               </w:rPr>
-              <w:t xml:space="preserve"> تحدد لكل مؤشر تكرار المتابعة وحدّ التدخل؛ وأي انحراف يُطلق دورة PDCA جديدة. وتشمل الاستدامة: تحديث المحتوى وفق الأدلة الإرشادية، وتوظيف نتائج الاختبارات لتحديد الفجوات المعرفية وتوجيه الخطة التدريبية المقبلة. </w:t>
-            </w:r>
-            <w:r>
-              <w:rPr>
-                <w:rFonts w:ascii="Arial" w:cs="Arial" w:hAnsi="Arial"/>
-                <w:b/>
-                <w:bCs/>
-                <w:color w:val="1D2B36"/>
-                <w:sz w:val="18"/>
-                <w:szCs w:val="18"/>
-                <w:rtl/>
-              </w:rPr>
-              <w:t xml:space="preserve">الدورة التالية (PDCA 2): </w:t>
-            </w:r>
-            <w:r>
-              <w:rPr>
-                <w:rFonts w:ascii="Arial" w:cs="Arial" w:hAnsi="Arial"/>
-                <w:color w:val="1D2B36"/>
-                <w:sz w:val="18"/>
-                <w:szCs w:val="18"/>
-                <w:rtl/>
-              </w:rPr>
-              <w:t xml:space="preserve">معالجة ملاحظات المستخدمين (استئناف الفيديو، وسرعة التحميل، ووحدات تعلّم مصغّر)، وإضافة محتوى للموضوعات الأدنى إنجازًا في 2025 وأولها علم الأدوية وإعطاؤها (11%) الذي طلبه المستخدمون أيضًا، ومعايرة المستهدفات لتجنّب الموضوعات ذات المستهدف الصفري (25 موضوعًا في 2025). </w:t>
-            </w:r>
-            <w:r>
-              <w:rPr>
-                <w:rFonts w:ascii="Arial" w:cs="Arial" w:hAnsi="Arial"/>
-                <w:b/>
-                <w:bCs/>
-                <w:color w:val="1D2B36"/>
-                <w:sz w:val="18"/>
-                <w:szCs w:val="18"/>
-                <w:rtl/>
-              </w:rPr>
-              <w:t xml:space="preserve">فرص التعميم: </w:t>
-            </w:r>
-            <w:r>
-              <w:rPr>
-                <w:rFonts w:ascii="Arial" w:cs="Arial" w:hAnsi="Arial"/>
-                <w:color w:val="1D2B36"/>
-                <w:sz w:val="18"/>
-                <w:szCs w:val="18"/>
-                <w:rtl/>
-              </w:rPr>
-              <w:t xml:space="preserve">إدراج المحتوى ضمن تهيئة الموظفين الجدد، ونقل التجربة إلى قطاعات وفئات مهنية أخرى بالتجمع.</w:t>
+              <w:t xml:space="preserve"> تحدد لكل مؤشر متى نراجعه ومتى نتدخل، فإذا انحرف أي مؤشر بدأنا دورة PDCA جديدة. وسنحدّث المحتوى كلما تغيرت الأدلة الإرشادية، ونستفيد من نتائج الاختبارات في معرفة الفجوات المعرفية وبناء الخطة التدريبية القادمة. </w:t>
+            </w:r>
+            <w:r>
+              <w:rPr>
+                <w:rFonts w:ascii="Arial" w:cs="Arial" w:hAnsi="Arial"/>
+                <w:b/>
+                <w:bCs/>
+                <w:color w:val="1D2B36"/>
+                <w:sz w:val="18"/>
+                <w:szCs w:val="18"/>
+                <w:rtl/>
+              </w:rPr>
+              <w:t xml:space="preserve">في الدورة القادمة </w:t>
+            </w:r>
+            <w:r>
+              <w:rPr>
+                <w:rFonts w:ascii="Arial" w:cs="Arial" w:hAnsi="Arial"/>
+                <w:color w:val="1D2B36"/>
+                <w:sz w:val="18"/>
+                <w:szCs w:val="18"/>
+                <w:rtl/>
+              </w:rPr>
+              <w:t xml:space="preserve">سنعالج ما اشتكى منه المستخدمون: الفيديو الذي يعود إلى البداية عند إيقافه، وبطء التحميل، وطول المقاطع. وسنضيف محتوى للموضوعات الأضعف إنجازًا في 2025، وأولها علم الأدوية وإعطاؤها (11%)، وهو ما طلبه أحد المستخدمين في الاستبيان أيضًا. وسنراجع طريقة تحديد المستهدفات حتى لا تتكرر الموضوعات ذات المستهدف الصفري، كما حدث في 25 موضوعًا في 2025. </w:t>
+            </w:r>
+            <w:r>
+              <w:rPr>
+                <w:rFonts w:ascii="Arial" w:cs="Arial" w:hAnsi="Arial"/>
+                <w:b/>
+                <w:bCs/>
+                <w:color w:val="1D2B36"/>
+                <w:sz w:val="18"/>
+                <w:szCs w:val="18"/>
+                <w:rtl/>
+              </w:rPr>
+              <w:t xml:space="preserve">أما التعميم </w:t>
+            </w:r>
+            <w:r>
+              <w:rPr>
+                <w:rFonts w:ascii="Arial" w:cs="Arial" w:hAnsi="Arial"/>
+                <w:color w:val="1D2B36"/>
+                <w:sz w:val="18"/>
+                <w:szCs w:val="18"/>
+                <w:rtl/>
+              </w:rPr>
+              <w:t xml:space="preserve">فنقترح إدراج المحتوى في برنامج تهيئة الموظفين الجدد، ونقل التجربة إلى قطاعات وفئات مهنية أخرى في التجمع.</w:t>
             </w:r>
           </w:p>
           <w:p>
@@ -4590,7 +4620,7 @@
                 <w:szCs w:val="16"/>
                 <w:rtl/>
               </w:rPr>
-              <w:t xml:space="preserve"> – تجاوزت 3 مؤشرات من 5 مستهدفاتها وتحقق المؤشران الآخران بالكامل</w:t>
+              <w:t xml:space="preserve"> – تجاوزت 3 مؤشرات من 5 مستهدفاتها، وتحقق المؤشران الآخران كاملين</w:t>
             </w:r>
           </w:p>
           <w:p>
@@ -4648,7 +4678,7 @@
                 <w:szCs w:val="18"/>
                 <w:rtl/>
               </w:rPr>
-              <w:t xml:space="preserve">بمعالجة السببين الجذريين معًا: فصل التعلّم النظري عن الموعد الثابت (مرونة تتوافق مع المناوبات)، ودمج القياس في مسار التعلّم (قبلي/بعدي/لاحق) لتوجيه المتابعة.</w:t>
+              <w:t xml:space="preserve">عالجنا السببين الجذريين معًا: فصلنا التعلّم النظري عن الموعد الثابت فصار الممرض يتعلّم بما يناسب مناوبته، وأدخلنا القياس في مسار التعلّم نفسه (قبلي وبعدي ولاحق) فأصبحنا نعرف أين نتدخل.</w:t>
             </w:r>
           </w:p>
           <w:p>
@@ -4677,7 +4707,7 @@
                 <w:szCs w:val="18"/>
                 <w:rtl/>
               </w:rPr>
-              <w:t xml:space="preserve">ارتفاع إنجاز المستهدفات الأكاديمية بنسبة 43.7% مقارنة بخط الأساس (من 69.60% إلى 100%).</w:t>
+              <w:t xml:space="preserve">ارتفع إنجاز المستهدفات الأكاديمية بنسبة 43.7% عن خط الأساس، من 69.60% إلى 100%.</w:t>
             </w:r>
           </w:p>
         </w:tc>
@@ -6617,7 +6647,7 @@
                 <w:szCs w:val="16"/>
                 <w:rtl/>
               </w:rPr>
-              <w:t xml:space="preserve"> – لم تُنسب وفورات مالية غير مُقاسة</w:t>
+              <w:t xml:space="preserve"> – لم نحسب وفورات مالية لأننا لم نقسها</w:t>
             </w:r>
           </w:p>
           <w:p>
@@ -6657,7 +6687,7 @@
                 <w:szCs w:val="16"/>
                 <w:rtl/>
               </w:rPr>
-              <w:t xml:space="preserve"> – عبر رفع الكفاءة المعرفية للكادر</w:t>
+              <w:t xml:space="preserve"> – برفع الكفاءة المعرفية للكادر</w:t>
             </w:r>
           </w:p>
           <w:p>
@@ -6697,7 +6727,7 @@
                 <w:szCs w:val="16"/>
                 <w:rtl/>
               </w:rPr>
-              <w:t xml:space="preserve"> – نصف جلسات 2025 كانت تكرارًا يُغني عنه المحتوى المسجّل</w:t>
+              <w:t xml:space="preserve"> – نصف جلسات 2025 كانت تكرارًا، والمحتوى المسجّل يغني عنه</w:t>
             </w:r>
           </w:p>
           <w:p>
@@ -6737,7 +6767,7 @@
                 <w:szCs w:val="16"/>
                 <w:rtl/>
               </w:rPr>
-              <w:t xml:space="preserve"> – مسار تعلّم مرن عند الطلب</w:t>
+              <w:t xml:space="preserve"> – مسار تعلّم مرن متاح في أي وقت</w:t>
             </w:r>
           </w:p>
           <w:p>
@@ -6777,7 +6807,7 @@
                 <w:szCs w:val="16"/>
                 <w:rtl/>
               </w:rPr>
-              <w:t xml:space="preserve"> رضا المستخدمين 94.7% · قياس منهجي لأثر التعلّم · قابلية التعميم</w:t>
+              <w:t xml:space="preserve"> رضا المستخدمين 94.7% · قياس منظّم لأثر التعلّم · قابلية التعميم</w:t>
             </w:r>
           </w:p>
         </w:tc>
@@ -6830,7 +6860,7 @@
                 <w:szCs w:val="18"/>
                 <w:rtl/>
               </w:rPr>
-              <w:t xml:space="preserve">تجسّد المبادرة مفهوم </w:t>
+              <w:t xml:space="preserve">ننظر إلى قيمة هذا المشروع من زاوية </w:t>
             </w:r>
             <w:r>
               <w:rPr>
@@ -6852,7 +6882,7 @@
                 <w:szCs w:val="18"/>
                 <w:rtl/>
               </w:rPr>
-              <w:t xml:space="preserve">؛ إذ القيمة = النتائج المتحققة ÷ تكلفة تحقيقها (Porter, 2010). فقد ارتفعت النتائج (إنجاز 100% وتحسّن معرفي +12.21 ن.م) مع خفض الجهد التشغيلي المتكرر، لأن المحتوى المسجّل يُنتَج مرة واحدة ويُعاد استخدامه دون تفريغ الكادر من المناوبات.</w:t>
+              <w:t xml:space="preserve">، التي تقيس القيمة بالنتائج مقارنةً بتكلفة تحقيقها (Porter, 2010). النتائج ارتفعت (إنجاز 100% وتحسّن معرفي 12.21 نقطة)، والجهد المتكرر انخفض، لأن المحاضرة المسجلة تُصنع مرة واحدة ويستفيد منها الجميع دون أن نسحب أحدًا من مناوبته.</w:t>
             </w:r>
           </w:p>
         </w:tc>
@@ -6910,7 +6940,7 @@
                 <w:szCs w:val="18"/>
                 <w:rtl/>
               </w:rPr>
-              <w:t xml:space="preserve">قيّم المستخدمون المنصة في خمسة محاور بمتوسط عام </w:t>
+              <w:t xml:space="preserve">قيّم المستخدمون المنصة في خمسة جوانب، وجاء المتوسط العام </w:t>
             </w:r>
             <w:r>
               <w:rPr>
@@ -6932,7 +6962,7 @@
                 <w:szCs w:val="18"/>
                 <w:rtl/>
               </w:rPr>
-              <w:t xml:space="preserve">، وكانت جميع الإجابات «موافق» أو «موافق بشدة»، وحصل وضوح التصميم على الدرجة الكاملة (5.00).</w:t>
+              <w:t xml:space="preserve">. لم يختر أحد «محايد» أو «غير موافق»، ونال وضوح التصميم الدرجة الكاملة (5.00).</w:t>
             </w:r>
           </w:p>
           <w:p>
@@ -6951,7 +6981,7 @@
                 <w:szCs w:val="18"/>
                 <w:rtl/>
               </w:rPr>
-              <w:t xml:space="preserve">«سهّلت علينا حضور المحاضرات في الأوقات التي تناسبنا حتى نركّز ونحصل على المعلومة بشكل واضح… استفدت منه أكثر من المحاضرات الأونلاين» – أحد المستخدمين</w:t>
+              <w:t xml:space="preserve">«سهلت علينا حضور المحاضرات في الأوقات اللي تناسبنا حتى نركز ونحصل على المعلومة بشكل واضح… استفدت منه أكثر من المحاضرات الأونلاين» – من ردود المستخدمين</w:t>
             </w:r>
           </w:p>
           <w:p>
@@ -6968,7 +6998,7 @@
                 <w:szCs w:val="16"/>
                 <w:rtl/>
               </w:rPr>
-              <w:t xml:space="preserve">وُظِّفت الملاحظات (استئناف الفيديو، وسرعة التحميل، وقِصَر المقاطع، وطلب محتوى الأدوية) مدخلاتٍ للدورة التالية من التحسين.</w:t>
+              <w:t xml:space="preserve">أخذنا ملاحظاتهم بجدية: إعادة تشغيل الفيديو، وسرعة التحميل، وطول المقاطع، وطلب محتوى عن الأدوية، وكلها دخلت في خطة الدورة القادمة.</w:t>
             </w:r>
           </w:p>
         </w:tc>
@@ -7268,7 +7298,7 @@
                       <w:szCs w:val="17"/>
                       <w:rtl/>
                     </w:rPr>
-                    <w:t xml:space="preserve">تحقيق كامل للمستهدفات الأكاديمية ورفع المعرفة التمريضية مع الاحتفاظ بها.</w:t>
+                    <w:t xml:space="preserve">حققنا المستهدفات الأكاديمية كاملة، وارتفعت معرفة الكادر وبقيت معه بعد التدريب.</w:t>
                   </w:r>
                 </w:p>
               </w:tc>
@@ -7381,7 +7411,7 @@
                       <w:szCs w:val="17"/>
                       <w:rtl/>
                     </w:rPr>
-                    <w:t xml:space="preserve">إنتاج المحتوى مرة واحدة وإعادة استخدامه لكل الكادر والموظفين الجدد، وإلغاء الحاجة إلى إعادة المحاضرات والتنسيق المتكرر لمواعيد البث.</w:t>
+                    <w:t xml:space="preserve">نسجّل المحاضرة مرة واحدة ويستفيد منها الكادر كله والموظفون الجدد، فلا حاجة إلى إعادة المحاضرات ولا إلى تنسيق مواعيد البث في كل مرة.</w:t>
                   </w:r>
                 </w:p>
               </w:tc>
@@ -7417,7 +7447,7 @@
                       <w:szCs w:val="17"/>
                       <w:rtl/>
                     </w:rPr>
-                    <w:t xml:space="preserve">خطة 2025: 106 جلسات لـ53 موضوعًا (نصفها تكرار) · للموضوعات الـ12: نحو 24 جلسة مباشرة سنويًا ← 5 محاضرات مسجلة (تقديري)</w:t>
+                    <w:t xml:space="preserve">خطة 2025: 106 جلسات لـ53 موضوعًا (نصفها تكرار) · للموضوعات الـ12: نحو 24 جلسة مباشرة سنويًا مقابل 5 محاضرات مسجلة (تقديري)</w:t>
                   </w:r>
                 </w:p>
               </w:tc>
@@ -7494,7 +7524,7 @@
                       <w:szCs w:val="17"/>
                       <w:rtl/>
                     </w:rPr>
-                    <w:t xml:space="preserve">تعلّم في الوقت المناسب لكل ممرض/ممرضة دون تعارض مع المناوبات وتغطية العيادات، ودون انقطاع الخدمة للمرضى.</w:t>
+                    <w:t xml:space="preserve">يتعلّم كل ممرض وممرضة في الوقت الذي يناسبه، دون أن يترك مناوبته أو عيادته، ودون أن يتأثر المرضى.</w:t>
                   </w:r>
                 </w:p>
               </w:tc>
@@ -7607,7 +7637,7 @@
                       <w:szCs w:val="17"/>
                       <w:rtl/>
                     </w:rPr>
-                    <w:t xml:space="preserve">رفع الجاهزية المعرفية في مجالات ذات صلة بسلامة المرضى مثل العلاج الوريدي وتحليل الأسباب الجذرية.</w:t>
+                    <w:t xml:space="preserve">رفعنا الجاهزية المعرفية في مجالات تمس سلامة المرضى، مثل العلاج الوريدي وتحليل الأسباب الجذرية.</w:t>
                   </w:r>
                 </w:p>
               </w:tc>
@@ -7643,7 +7673,7 @@
                       <w:szCs w:val="17"/>
                       <w:rtl/>
                     </w:rPr>
-                    <w:t xml:space="preserve">نتائج الاختبارات حسب الموضوع (أثر سريري غير مُقاس مباشرة)</w:t>
+                    <w:t xml:space="preserve">نتائج الاختبارات حسب الموضوع (الأثر السريري لم يُقس مباشرة)</w:t>
                   </w:r>
                 </w:p>
               </w:tc>

</xml_diff>